<commit_message>
A little rebuild repositories and added itip lab3 beta
</commit_message>
<xml_diff>
--- a/DevOps/lab3/lab3.docx
+++ b/DevOps/lab3/lab3.docx
@@ -373,24 +373,24 @@
           <w:szCs w:val="24"/>
         </w:rPr>
       </w:pPr>
+      <w:proofErr w:type="spellStart"/>
       <w:r>
         <w:rPr>
           <w:rFonts w:ascii="Times New Roman" w:eastAsia="Calibri" w:hAnsi="Times New Roman" w:cs="Times New Roman"/>
           <w:sz w:val="24"/>
           <w:szCs w:val="24"/>
         </w:rPr>
-        <w:t>Аралушкин Максим Дмитриевич</w:t>
-      </w:r>
-    </w:p>
-    <w:p>
-      <w:pPr>
-        <w:jc w:val="right"/>
+        <w:t>Аралушкин</w:t>
+      </w:r>
+      <w:proofErr w:type="spellEnd"/>
+      <w:r>
         <w:rPr>
           <w:rFonts w:ascii="Times New Roman" w:eastAsia="Calibri" w:hAnsi="Times New Roman" w:cs="Times New Roman"/>
           <w:sz w:val="24"/>
           <w:szCs w:val="24"/>
         </w:rPr>
-      </w:pPr>
+        <w:t xml:space="preserve"> Максим Дмитриевич</w:t>
+      </w:r>
     </w:p>
     <w:p>
       <w:pPr>
@@ -401,24 +401,24 @@
           <w:szCs w:val="24"/>
         </w:rPr>
       </w:pPr>
-      <w:r>
+    </w:p>
+    <w:p>
+      <w:pPr>
+        <w:jc w:val="right"/>
         <w:rPr>
           <w:rFonts w:ascii="Times New Roman" w:eastAsia="Calibri" w:hAnsi="Times New Roman" w:cs="Times New Roman"/>
           <w:sz w:val="24"/>
           <w:szCs w:val="24"/>
         </w:rPr>
-        <w:t>Проверил: Тимчук А.В.</w:t>
-      </w:r>
-    </w:p>
-    <w:p>
-      <w:pPr>
-        <w:jc w:val="right"/>
+      </w:pPr>
+      <w:r>
         <w:rPr>
           <w:rFonts w:ascii="Times New Roman" w:eastAsia="Calibri" w:hAnsi="Times New Roman" w:cs="Times New Roman"/>
           <w:sz w:val="24"/>
           <w:szCs w:val="24"/>
         </w:rPr>
-      </w:pPr>
+        <w:t>Проверил: Тимчук А.В.</w:t>
+      </w:r>
     </w:p>
     <w:p>
       <w:pPr>
@@ -452,6 +452,7 @@
     </w:p>
     <w:p>
       <w:pPr>
+        <w:jc w:val="right"/>
         <w:rPr>
           <w:rFonts w:ascii="Times New Roman" w:eastAsia="Calibri" w:hAnsi="Times New Roman" w:cs="Times New Roman"/>
           <w:sz w:val="24"/>
@@ -461,27 +462,36 @@
     </w:p>
     <w:p>
       <w:pPr>
-        <w:jc w:val="center"/>
         <w:rPr>
           <w:rFonts w:ascii="Times New Roman" w:eastAsia="Calibri" w:hAnsi="Times New Roman" w:cs="Times New Roman"/>
           <w:sz w:val="24"/>
           <w:szCs w:val="24"/>
         </w:rPr>
       </w:pPr>
-      <w:r>
+    </w:p>
+    <w:p>
+      <w:pPr>
+        <w:jc w:val="center"/>
         <w:rPr>
           <w:rFonts w:ascii="Times New Roman" w:eastAsia="Calibri" w:hAnsi="Times New Roman" w:cs="Times New Roman"/>
           <w:sz w:val="24"/>
           <w:szCs w:val="24"/>
         </w:rPr>
-        <w:t>Москва, 202</w:t>
-      </w:r>
+      </w:pPr>
       <w:r>
         <w:rPr>
           <w:rFonts w:ascii="Times New Roman" w:eastAsia="Calibri" w:hAnsi="Times New Roman" w:cs="Times New Roman"/>
           <w:sz w:val="24"/>
           <w:szCs w:val="24"/>
         </w:rPr>
+        <w:t>Москва, 202</w:t>
+      </w:r>
+      <w:r>
+        <w:rPr>
+          <w:rFonts w:ascii="Times New Roman" w:eastAsia="Calibri" w:hAnsi="Times New Roman" w:cs="Times New Roman"/>
+          <w:sz w:val="24"/>
+          <w:szCs w:val="24"/>
+        </w:rPr>
         <w:t>6</w:t>
       </w:r>
     </w:p>
@@ -594,6 +604,7 @@
         </w:rPr>
         <w:t xml:space="preserve">формат описания образов с помощью </w:t>
       </w:r>
+      <w:proofErr w:type="spellStart"/>
       <w:r>
         <w:rPr>
           <w:rFonts w:ascii="Times New Roman" w:hAnsi="Times New Roman" w:cs="Times New Roman"/>
@@ -601,7 +612,17 @@
           <w:szCs w:val="28"/>
           <w:lang w:val="en-US"/>
         </w:rPr>
-        <w:t>Dockerfile.</w:t>
+        <w:t>Dockerfile</w:t>
+      </w:r>
+      <w:proofErr w:type="spellEnd"/>
+      <w:r>
+        <w:rPr>
+          <w:rFonts w:ascii="Times New Roman" w:hAnsi="Times New Roman" w:cs="Times New Roman"/>
+          <w:sz w:val="28"/>
+          <w:szCs w:val="28"/>
+          <w:lang w:val="en-US"/>
+        </w:rPr>
+        <w:t>.</w:t>
       </w:r>
     </w:p>
     <w:p>
@@ -756,6 +777,7 @@
         <w:lastRenderedPageBreak/>
         <w:t xml:space="preserve">С помощью </w:t>
       </w:r>
+      <w:proofErr w:type="spellStart"/>
       <w:r>
         <w:rPr>
           <w:rFonts w:ascii="Times New Roman" w:hAnsi="Times New Roman" w:cs="Times New Roman"/>
@@ -765,6 +787,7 @@
         </w:rPr>
         <w:t>jq</w:t>
       </w:r>
+      <w:proofErr w:type="spellEnd"/>
       <w:r>
         <w:rPr>
           <w:rFonts w:ascii="Times New Roman" w:hAnsi="Times New Roman" w:cs="Times New Roman"/>
@@ -845,7 +868,6 @@
           <w:rFonts w:ascii="Times New Roman" w:hAnsi="Times New Roman" w:cs="Times New Roman"/>
           <w:sz w:val="28"/>
           <w:szCs w:val="28"/>
-          <w:lang w:val="en-US"/>
         </w:rPr>
       </w:pPr>
       <w:r>
@@ -857,6 +879,7 @@
         <w:lastRenderedPageBreak/>
         <w:t xml:space="preserve">Описание </w:t>
       </w:r>
+      <w:proofErr w:type="spellStart"/>
       <w:r>
         <w:rPr>
           <w:rFonts w:ascii="Times New Roman" w:hAnsi="Times New Roman" w:cs="Times New Roman"/>
@@ -866,6 +889,7 @@
         </w:rPr>
         <w:t>Dockerfile</w:t>
       </w:r>
+      <w:proofErr w:type="spellEnd"/>
       <w:r>
         <w:rPr>
           <w:rFonts w:ascii="Times New Roman" w:hAnsi="Times New Roman" w:cs="Times New Roman"/>
@@ -889,15 +913,7 @@
           <w:sz w:val="28"/>
           <w:szCs w:val="28"/>
         </w:rPr>
-        <w:t xml:space="preserve"> приложения</w:t>
-      </w:r>
-      <w:r>
-        <w:rPr>
-          <w:rFonts w:ascii="Times New Roman" w:hAnsi="Times New Roman" w:cs="Times New Roman"/>
-          <w:sz w:val="28"/>
-          <w:szCs w:val="28"/>
-        </w:rPr>
-        <w:t>:</w:t>
+        <w:t xml:space="preserve"> приложения:</w:t>
       </w:r>
     </w:p>
     <w:p>
@@ -952,6 +968,633 @@
     </w:p>
     <w:p>
       <w:pPr>
+        <w:shd w:val="clear" w:color="auto" w:fill="1E1E1E"/>
+        <w:spacing w:after="0" w:line="285" w:lineRule="atLeast"/>
+        <w:rPr>
+          <w:rFonts w:ascii="Consolas" w:eastAsia="Times New Roman" w:hAnsi="Consolas" w:cs="Times New Roman"/>
+          <w:color w:val="C5C8C6"/>
+          <w:kern w:val="0"/>
+          <w:sz w:val="21"/>
+          <w:szCs w:val="21"/>
+          <w:lang w:val="en-US" w:eastAsia="ja-JP"/>
+          <w14:ligatures w14:val="none"/>
+        </w:rPr>
+      </w:pPr>
+      <w:r>
+        <w:rPr>
+          <w:rFonts w:ascii="Consolas" w:eastAsia="Times New Roman" w:hAnsi="Consolas" w:cs="Times New Roman"/>
+          <w:color w:val="676867"/>
+          <w:kern w:val="0"/>
+          <w:sz w:val="21"/>
+          <w:szCs w:val="21"/>
+          <w:lang w:val="en-US" w:eastAsia="ja-JP"/>
+          <w14:ligatures w14:val="none"/>
+        </w:rPr>
+        <w:t>FROM</w:t>
+      </w:r>
+      <w:r>
+        <w:rPr>
+          <w:rFonts w:ascii="Consolas" w:eastAsia="Times New Roman" w:hAnsi="Consolas" w:cs="Times New Roman"/>
+          <w:color w:val="C5C8C6"/>
+          <w:kern w:val="0"/>
+          <w:sz w:val="21"/>
+          <w:szCs w:val="21"/>
+          <w:lang w:val="en-US" w:eastAsia="ja-JP"/>
+          <w14:ligatures w14:val="none"/>
+        </w:rPr>
+        <w:t xml:space="preserve"> python:3.12-slim </w:t>
+      </w:r>
+    </w:p>
+    <w:p>
+      <w:pPr>
+        <w:shd w:val="clear" w:color="auto" w:fill="1E1E1E"/>
+        <w:spacing w:after="0" w:line="285" w:lineRule="atLeast"/>
+        <w:rPr>
+          <w:rFonts w:ascii="Consolas" w:eastAsia="Times New Roman" w:hAnsi="Consolas" w:cs="Times New Roman"/>
+          <w:color w:val="C5C8C6"/>
+          <w:kern w:val="0"/>
+          <w:sz w:val="21"/>
+          <w:szCs w:val="21"/>
+          <w:lang w:val="en-US" w:eastAsia="ja-JP"/>
+          <w14:ligatures w14:val="none"/>
+        </w:rPr>
+      </w:pPr>
+      <w:r>
+        <w:rPr>
+          <w:rFonts w:ascii="Consolas" w:eastAsia="Times New Roman" w:hAnsi="Consolas" w:cs="Times New Roman"/>
+          <w:color w:val="C5C8C6"/>
+          <w:kern w:val="0"/>
+          <w:sz w:val="21"/>
+          <w:szCs w:val="21"/>
+          <w:lang w:val="en-US" w:eastAsia="ja-JP"/>
+          <w14:ligatures w14:val="none"/>
+        </w:rPr>
+        <w:t> </w:t>
+      </w:r>
+    </w:p>
+    <w:p>
+      <w:pPr>
+        <w:shd w:val="clear" w:color="auto" w:fill="1E1E1E"/>
+        <w:spacing w:after="0" w:line="285" w:lineRule="atLeast"/>
+        <w:rPr>
+          <w:rFonts w:ascii="Consolas" w:eastAsia="Times New Roman" w:hAnsi="Consolas" w:cs="Times New Roman"/>
+          <w:color w:val="C5C8C6"/>
+          <w:kern w:val="0"/>
+          <w:sz w:val="21"/>
+          <w:szCs w:val="21"/>
+          <w:lang w:val="en-US" w:eastAsia="ja-JP"/>
+          <w14:ligatures w14:val="none"/>
+        </w:rPr>
+      </w:pPr>
+      <w:r>
+        <w:rPr>
+          <w:rFonts w:ascii="Consolas" w:eastAsia="Times New Roman" w:hAnsi="Consolas" w:cs="Times New Roman"/>
+          <w:color w:val="676867"/>
+          <w:kern w:val="0"/>
+          <w:sz w:val="21"/>
+          <w:szCs w:val="21"/>
+          <w:lang w:val="en-US" w:eastAsia="ja-JP"/>
+          <w14:ligatures w14:val="none"/>
+        </w:rPr>
+        <w:t>WORKDIR</w:t>
+      </w:r>
+      <w:r>
+        <w:rPr>
+          <w:rFonts w:ascii="Consolas" w:eastAsia="Times New Roman" w:hAnsi="Consolas" w:cs="Times New Roman"/>
+          <w:color w:val="C5C8C6"/>
+          <w:kern w:val="0"/>
+          <w:sz w:val="21"/>
+          <w:szCs w:val="21"/>
+          <w:lang w:val="en-US" w:eastAsia="ja-JP"/>
+          <w14:ligatures w14:val="none"/>
+        </w:rPr>
+        <w:t xml:space="preserve"> /app </w:t>
+      </w:r>
+    </w:p>
+    <w:p>
+      <w:pPr>
+        <w:shd w:val="clear" w:color="auto" w:fill="1E1E1E"/>
+        <w:spacing w:after="0" w:line="285" w:lineRule="atLeast"/>
+        <w:rPr>
+          <w:rFonts w:ascii="Consolas" w:eastAsia="Times New Roman" w:hAnsi="Consolas" w:cs="Times New Roman"/>
+          <w:color w:val="C5C8C6"/>
+          <w:kern w:val="0"/>
+          <w:sz w:val="21"/>
+          <w:szCs w:val="21"/>
+          <w:lang w:val="en-US" w:eastAsia="ja-JP"/>
+          <w14:ligatures w14:val="none"/>
+        </w:rPr>
+      </w:pPr>
+      <w:r>
+        <w:rPr>
+          <w:rFonts w:ascii="Consolas" w:eastAsia="Times New Roman" w:hAnsi="Consolas" w:cs="Times New Roman"/>
+          <w:color w:val="C5C8C6"/>
+          <w:kern w:val="0"/>
+          <w:sz w:val="21"/>
+          <w:szCs w:val="21"/>
+          <w:lang w:val="en-US" w:eastAsia="ja-JP"/>
+          <w14:ligatures w14:val="none"/>
+        </w:rPr>
+        <w:t> </w:t>
+      </w:r>
+    </w:p>
+    <w:p>
+      <w:pPr>
+        <w:shd w:val="clear" w:color="auto" w:fill="1E1E1E"/>
+        <w:spacing w:after="0" w:line="285" w:lineRule="atLeast"/>
+        <w:rPr>
+          <w:rFonts w:ascii="Consolas" w:eastAsia="Times New Roman" w:hAnsi="Consolas" w:cs="Times New Roman"/>
+          <w:color w:val="C5C8C6"/>
+          <w:kern w:val="0"/>
+          <w:sz w:val="21"/>
+          <w:szCs w:val="21"/>
+          <w:lang w:val="en-US" w:eastAsia="ja-JP"/>
+          <w14:ligatures w14:val="none"/>
+        </w:rPr>
+      </w:pPr>
+      <w:r>
+        <w:rPr>
+          <w:rFonts w:ascii="Consolas" w:eastAsia="Times New Roman" w:hAnsi="Consolas" w:cs="Times New Roman"/>
+          <w:color w:val="676867"/>
+          <w:kern w:val="0"/>
+          <w:sz w:val="21"/>
+          <w:szCs w:val="21"/>
+          <w:lang w:val="en-US" w:eastAsia="ja-JP"/>
+          <w14:ligatures w14:val="none"/>
+        </w:rPr>
+        <w:t>COPY</w:t>
+      </w:r>
+      <w:r>
+        <w:rPr>
+          <w:rFonts w:ascii="Consolas" w:eastAsia="Times New Roman" w:hAnsi="Consolas" w:cs="Times New Roman"/>
+          <w:color w:val="C5C8C6"/>
+          <w:kern w:val="0"/>
+          <w:sz w:val="21"/>
+          <w:szCs w:val="21"/>
+          <w:lang w:val="en-US" w:eastAsia="ja-JP"/>
+          <w14:ligatures w14:val="none"/>
+        </w:rPr>
+        <w:t xml:space="preserve"> </w:t>
+      </w:r>
+      <w:proofErr w:type="gramStart"/>
+      <w:r>
+        <w:rPr>
+          <w:rFonts w:ascii="Consolas" w:eastAsia="Times New Roman" w:hAnsi="Consolas" w:cs="Times New Roman"/>
+          <w:color w:val="C5C8C6"/>
+          <w:kern w:val="0"/>
+          <w:sz w:val="21"/>
+          <w:szCs w:val="21"/>
+          <w:lang w:val="en-US" w:eastAsia="ja-JP"/>
+          <w14:ligatures w14:val="none"/>
+        </w:rPr>
+        <w:t>requirements.txt .</w:t>
+      </w:r>
+      <w:proofErr w:type="gramEnd"/>
+      <w:r>
+        <w:rPr>
+          <w:rFonts w:ascii="Consolas" w:eastAsia="Times New Roman" w:hAnsi="Consolas" w:cs="Times New Roman"/>
+          <w:color w:val="C5C8C6"/>
+          <w:kern w:val="0"/>
+          <w:sz w:val="21"/>
+          <w:szCs w:val="21"/>
+          <w:lang w:val="en-US" w:eastAsia="ja-JP"/>
+          <w14:ligatures w14:val="none"/>
+        </w:rPr>
+        <w:t xml:space="preserve"> </w:t>
+      </w:r>
+    </w:p>
+    <w:p>
+      <w:pPr>
+        <w:shd w:val="clear" w:color="auto" w:fill="1E1E1E"/>
+        <w:spacing w:after="0" w:line="285" w:lineRule="atLeast"/>
+        <w:rPr>
+          <w:rFonts w:ascii="Consolas" w:eastAsia="Times New Roman" w:hAnsi="Consolas" w:cs="Times New Roman"/>
+          <w:color w:val="C5C8C6"/>
+          <w:kern w:val="0"/>
+          <w:sz w:val="21"/>
+          <w:szCs w:val="21"/>
+          <w:lang w:val="en-US" w:eastAsia="ja-JP"/>
+          <w14:ligatures w14:val="none"/>
+        </w:rPr>
+      </w:pPr>
+      <w:r>
+        <w:rPr>
+          <w:rFonts w:ascii="Consolas" w:eastAsia="Times New Roman" w:hAnsi="Consolas" w:cs="Times New Roman"/>
+          <w:color w:val="C5C8C6"/>
+          <w:kern w:val="0"/>
+          <w:sz w:val="21"/>
+          <w:szCs w:val="21"/>
+          <w:lang w:val="en-US" w:eastAsia="ja-JP"/>
+          <w14:ligatures w14:val="none"/>
+        </w:rPr>
+        <w:t> </w:t>
+      </w:r>
+    </w:p>
+    <w:p>
+      <w:pPr>
+        <w:shd w:val="clear" w:color="auto" w:fill="1E1E1E"/>
+        <w:spacing w:after="0" w:line="285" w:lineRule="atLeast"/>
+        <w:rPr>
+          <w:rFonts w:ascii="Consolas" w:eastAsia="Times New Roman" w:hAnsi="Consolas" w:cs="Times New Roman"/>
+          <w:color w:val="C5C8C6"/>
+          <w:kern w:val="0"/>
+          <w:sz w:val="21"/>
+          <w:szCs w:val="21"/>
+          <w:lang w:val="en-US" w:eastAsia="ja-JP"/>
+          <w14:ligatures w14:val="none"/>
+        </w:rPr>
+      </w:pPr>
+      <w:r>
+        <w:rPr>
+          <w:rFonts w:ascii="Consolas" w:eastAsia="Times New Roman" w:hAnsi="Consolas" w:cs="Times New Roman"/>
+          <w:color w:val="676867"/>
+          <w:kern w:val="0"/>
+          <w:sz w:val="21"/>
+          <w:szCs w:val="21"/>
+          <w:lang w:val="en-US" w:eastAsia="ja-JP"/>
+          <w14:ligatures w14:val="none"/>
+        </w:rPr>
+        <w:t>RUN</w:t>
+      </w:r>
+      <w:r>
+        <w:rPr>
+          <w:rFonts w:ascii="Consolas" w:eastAsia="Times New Roman" w:hAnsi="Consolas" w:cs="Times New Roman"/>
+          <w:color w:val="C5C8C6"/>
+          <w:kern w:val="0"/>
+          <w:sz w:val="21"/>
+          <w:szCs w:val="21"/>
+          <w:lang w:val="en-US" w:eastAsia="ja-JP"/>
+          <w14:ligatures w14:val="none"/>
+        </w:rPr>
+        <w:t xml:space="preserve"> pip install --no-cache-</w:t>
+      </w:r>
+      <w:proofErr w:type="spellStart"/>
+      <w:r>
+        <w:rPr>
+          <w:rFonts w:ascii="Consolas" w:eastAsia="Times New Roman" w:hAnsi="Consolas" w:cs="Times New Roman"/>
+          <w:color w:val="C5C8C6"/>
+          <w:kern w:val="0"/>
+          <w:sz w:val="21"/>
+          <w:szCs w:val="21"/>
+          <w:lang w:val="en-US" w:eastAsia="ja-JP"/>
+          <w14:ligatures w14:val="none"/>
+        </w:rPr>
+        <w:t>dir</w:t>
+      </w:r>
+      <w:proofErr w:type="spellEnd"/>
+      <w:r>
+        <w:rPr>
+          <w:rFonts w:ascii="Consolas" w:eastAsia="Times New Roman" w:hAnsi="Consolas" w:cs="Times New Roman"/>
+          <w:color w:val="C5C8C6"/>
+          <w:kern w:val="0"/>
+          <w:sz w:val="21"/>
+          <w:szCs w:val="21"/>
+          <w:lang w:val="en-US" w:eastAsia="ja-JP"/>
+          <w14:ligatures w14:val="none"/>
+        </w:rPr>
+        <w:t xml:space="preserve"> -r requirements.txt </w:t>
+      </w:r>
+    </w:p>
+    <w:p>
+      <w:pPr>
+        <w:shd w:val="clear" w:color="auto" w:fill="1E1E1E"/>
+        <w:spacing w:after="0" w:line="285" w:lineRule="atLeast"/>
+        <w:rPr>
+          <w:rFonts w:ascii="Consolas" w:eastAsia="Times New Roman" w:hAnsi="Consolas" w:cs="Times New Roman"/>
+          <w:color w:val="C5C8C6"/>
+          <w:kern w:val="0"/>
+          <w:sz w:val="21"/>
+          <w:szCs w:val="21"/>
+          <w:lang w:val="en-US" w:eastAsia="ja-JP"/>
+          <w14:ligatures w14:val="none"/>
+        </w:rPr>
+      </w:pPr>
+      <w:r>
+        <w:rPr>
+          <w:rFonts w:ascii="Consolas" w:eastAsia="Times New Roman" w:hAnsi="Consolas" w:cs="Times New Roman"/>
+          <w:color w:val="C5C8C6"/>
+          <w:kern w:val="0"/>
+          <w:sz w:val="21"/>
+          <w:szCs w:val="21"/>
+          <w:lang w:val="en-US" w:eastAsia="ja-JP"/>
+          <w14:ligatures w14:val="none"/>
+        </w:rPr>
+        <w:t> </w:t>
+      </w:r>
+    </w:p>
+    <w:p>
+      <w:pPr>
+        <w:shd w:val="clear" w:color="auto" w:fill="1E1E1E"/>
+        <w:spacing w:after="0" w:line="285" w:lineRule="atLeast"/>
+        <w:rPr>
+          <w:rFonts w:ascii="Consolas" w:eastAsia="Times New Roman" w:hAnsi="Consolas" w:cs="Times New Roman"/>
+          <w:color w:val="C5C8C6"/>
+          <w:kern w:val="0"/>
+          <w:sz w:val="21"/>
+          <w:szCs w:val="21"/>
+          <w:lang w:val="en-US" w:eastAsia="ja-JP"/>
+          <w14:ligatures w14:val="none"/>
+        </w:rPr>
+      </w:pPr>
+      <w:r>
+        <w:rPr>
+          <w:rFonts w:ascii="Consolas" w:eastAsia="Times New Roman" w:hAnsi="Consolas" w:cs="Times New Roman"/>
+          <w:color w:val="676867"/>
+          <w:kern w:val="0"/>
+          <w:sz w:val="21"/>
+          <w:szCs w:val="21"/>
+          <w:lang w:val="en-US" w:eastAsia="ja-JP"/>
+          <w14:ligatures w14:val="none"/>
+        </w:rPr>
+        <w:t>COPY</w:t>
+      </w:r>
+      <w:r>
+        <w:rPr>
+          <w:rFonts w:ascii="Consolas" w:eastAsia="Times New Roman" w:hAnsi="Consolas" w:cs="Times New Roman"/>
+          <w:color w:val="C5C8C6"/>
+          <w:kern w:val="0"/>
+          <w:sz w:val="21"/>
+          <w:szCs w:val="21"/>
+          <w:lang w:val="en-US" w:eastAsia="ja-JP"/>
+          <w14:ligatures w14:val="none"/>
+        </w:rPr>
+        <w:t xml:space="preserve"> </w:t>
+      </w:r>
+      <w:proofErr w:type="spellStart"/>
+      <w:r>
+        <w:rPr>
+          <w:rFonts w:ascii="Consolas" w:eastAsia="Times New Roman" w:hAnsi="Consolas" w:cs="Times New Roman"/>
+          <w:color w:val="C5C8C6"/>
+          <w:kern w:val="0"/>
+          <w:sz w:val="21"/>
+          <w:szCs w:val="21"/>
+          <w:lang w:val="en-US" w:eastAsia="ja-JP"/>
+          <w14:ligatures w14:val="none"/>
+        </w:rPr>
+        <w:t>src</w:t>
+      </w:r>
+      <w:proofErr w:type="spellEnd"/>
+      <w:proofErr w:type="gramStart"/>
+      <w:r>
+        <w:rPr>
+          <w:rFonts w:ascii="Consolas" w:eastAsia="Times New Roman" w:hAnsi="Consolas" w:cs="Times New Roman"/>
+          <w:color w:val="C5C8C6"/>
+          <w:kern w:val="0"/>
+          <w:sz w:val="21"/>
+          <w:szCs w:val="21"/>
+          <w:lang w:val="en-US" w:eastAsia="ja-JP"/>
+          <w14:ligatures w14:val="none"/>
+        </w:rPr>
+        <w:t>/ .</w:t>
+      </w:r>
+      <w:proofErr w:type="gramEnd"/>
+      <w:r>
+        <w:rPr>
+          <w:rFonts w:ascii="Consolas" w:eastAsia="Times New Roman" w:hAnsi="Consolas" w:cs="Times New Roman"/>
+          <w:color w:val="C5C8C6"/>
+          <w:kern w:val="0"/>
+          <w:sz w:val="21"/>
+          <w:szCs w:val="21"/>
+          <w:lang w:val="en-US" w:eastAsia="ja-JP"/>
+          <w14:ligatures w14:val="none"/>
+        </w:rPr>
+        <w:t>/</w:t>
+      </w:r>
+      <w:proofErr w:type="spellStart"/>
+      <w:r>
+        <w:rPr>
+          <w:rFonts w:ascii="Consolas" w:eastAsia="Times New Roman" w:hAnsi="Consolas" w:cs="Times New Roman"/>
+          <w:color w:val="C5C8C6"/>
+          <w:kern w:val="0"/>
+          <w:sz w:val="21"/>
+          <w:szCs w:val="21"/>
+          <w:lang w:val="en-US" w:eastAsia="ja-JP"/>
+          <w14:ligatures w14:val="none"/>
+        </w:rPr>
+        <w:t>src</w:t>
+      </w:r>
+      <w:proofErr w:type="spellEnd"/>
+      <w:r>
+        <w:rPr>
+          <w:rFonts w:ascii="Consolas" w:eastAsia="Times New Roman" w:hAnsi="Consolas" w:cs="Times New Roman"/>
+          <w:color w:val="C5C8C6"/>
+          <w:kern w:val="0"/>
+          <w:sz w:val="21"/>
+          <w:szCs w:val="21"/>
+          <w:lang w:val="en-US" w:eastAsia="ja-JP"/>
+          <w14:ligatures w14:val="none"/>
+        </w:rPr>
+        <w:t xml:space="preserve">/ </w:t>
+      </w:r>
+    </w:p>
+    <w:p>
+      <w:pPr>
+        <w:shd w:val="clear" w:color="auto" w:fill="1E1E1E"/>
+        <w:spacing w:after="0" w:line="285" w:lineRule="atLeast"/>
+        <w:rPr>
+          <w:rFonts w:ascii="Consolas" w:eastAsia="Times New Roman" w:hAnsi="Consolas" w:cs="Times New Roman"/>
+          <w:color w:val="C5C8C6"/>
+          <w:kern w:val="0"/>
+          <w:sz w:val="21"/>
+          <w:szCs w:val="21"/>
+          <w:lang w:val="en-US" w:eastAsia="ja-JP"/>
+          <w14:ligatures w14:val="none"/>
+        </w:rPr>
+      </w:pPr>
+      <w:r>
+        <w:rPr>
+          <w:rFonts w:ascii="Consolas" w:eastAsia="Times New Roman" w:hAnsi="Consolas" w:cs="Times New Roman"/>
+          <w:color w:val="C5C8C6"/>
+          <w:kern w:val="0"/>
+          <w:sz w:val="21"/>
+          <w:szCs w:val="21"/>
+          <w:lang w:val="en-US" w:eastAsia="ja-JP"/>
+          <w14:ligatures w14:val="none"/>
+        </w:rPr>
+        <w:t> </w:t>
+      </w:r>
+    </w:p>
+    <w:p>
+      <w:pPr>
+        <w:shd w:val="clear" w:color="auto" w:fill="1E1E1E"/>
+        <w:spacing w:after="0" w:line="285" w:lineRule="atLeast"/>
+        <w:rPr>
+          <w:rFonts w:ascii="Consolas" w:eastAsia="Times New Roman" w:hAnsi="Consolas" w:cs="Times New Roman"/>
+          <w:color w:val="C5C8C6"/>
+          <w:kern w:val="0"/>
+          <w:sz w:val="21"/>
+          <w:szCs w:val="21"/>
+          <w:lang w:val="en-US" w:eastAsia="ja-JP"/>
+          <w14:ligatures w14:val="none"/>
+        </w:rPr>
+      </w:pPr>
+      <w:r>
+        <w:rPr>
+          <w:rFonts w:ascii="Consolas" w:eastAsia="Times New Roman" w:hAnsi="Consolas" w:cs="Times New Roman"/>
+          <w:color w:val="676867"/>
+          <w:kern w:val="0"/>
+          <w:sz w:val="21"/>
+          <w:szCs w:val="21"/>
+          <w:lang w:val="en-US" w:eastAsia="ja-JP"/>
+          <w14:ligatures w14:val="none"/>
+        </w:rPr>
+        <w:t>EXPOSE</w:t>
+      </w:r>
+      <w:r>
+        <w:rPr>
+          <w:rFonts w:ascii="Consolas" w:eastAsia="Times New Roman" w:hAnsi="Consolas" w:cs="Times New Roman"/>
+          <w:color w:val="C5C8C6"/>
+          <w:kern w:val="0"/>
+          <w:sz w:val="21"/>
+          <w:szCs w:val="21"/>
+          <w:lang w:val="en-US" w:eastAsia="ja-JP"/>
+          <w14:ligatures w14:val="none"/>
+        </w:rPr>
+        <w:t xml:space="preserve"> 8080 </w:t>
+      </w:r>
+    </w:p>
+    <w:p>
+      <w:pPr>
+        <w:shd w:val="clear" w:color="auto" w:fill="1E1E1E"/>
+        <w:spacing w:after="0" w:line="285" w:lineRule="atLeast"/>
+        <w:rPr>
+          <w:rFonts w:ascii="Consolas" w:eastAsia="Times New Roman" w:hAnsi="Consolas" w:cs="Times New Roman"/>
+          <w:color w:val="C5C8C6"/>
+          <w:kern w:val="0"/>
+          <w:sz w:val="21"/>
+          <w:szCs w:val="21"/>
+          <w:lang w:val="en-US" w:eastAsia="ja-JP"/>
+          <w14:ligatures w14:val="none"/>
+        </w:rPr>
+      </w:pPr>
+      <w:r>
+        <w:rPr>
+          <w:rFonts w:ascii="Consolas" w:eastAsia="Times New Roman" w:hAnsi="Consolas" w:cs="Times New Roman"/>
+          <w:color w:val="C5C8C6"/>
+          <w:kern w:val="0"/>
+          <w:sz w:val="21"/>
+          <w:szCs w:val="21"/>
+          <w:lang w:val="en-US" w:eastAsia="ja-JP"/>
+          <w14:ligatures w14:val="none"/>
+        </w:rPr>
+        <w:t> </w:t>
+      </w:r>
+    </w:p>
+    <w:p>
+      <w:pPr>
+        <w:shd w:val="clear" w:color="auto" w:fill="1E1E1E"/>
+        <w:spacing w:after="0" w:line="285" w:lineRule="atLeast"/>
+        <w:rPr>
+          <w:rFonts w:ascii="Consolas" w:eastAsia="Times New Roman" w:hAnsi="Consolas" w:cs="Times New Roman"/>
+          <w:color w:val="C5C8C6"/>
+          <w:kern w:val="0"/>
+          <w:sz w:val="21"/>
+          <w:szCs w:val="21"/>
+          <w:lang w:val="en-US" w:eastAsia="ja-JP"/>
+          <w14:ligatures w14:val="none"/>
+        </w:rPr>
+      </w:pPr>
+      <w:r>
+        <w:rPr>
+          <w:rFonts w:ascii="Consolas" w:eastAsia="Times New Roman" w:hAnsi="Consolas" w:cs="Times New Roman"/>
+          <w:color w:val="676867"/>
+          <w:kern w:val="0"/>
+          <w:sz w:val="21"/>
+          <w:szCs w:val="21"/>
+          <w:lang w:val="en-US" w:eastAsia="ja-JP"/>
+          <w14:ligatures w14:val="none"/>
+        </w:rPr>
+        <w:t>CMD</w:t>
+      </w:r>
+      <w:r>
+        <w:rPr>
+          <w:rFonts w:ascii="Consolas" w:eastAsia="Times New Roman" w:hAnsi="Consolas" w:cs="Times New Roman"/>
+          <w:color w:val="C5C8C6"/>
+          <w:kern w:val="0"/>
+          <w:sz w:val="21"/>
+          <w:szCs w:val="21"/>
+          <w:lang w:val="en-US" w:eastAsia="ja-JP"/>
+          <w14:ligatures w14:val="none"/>
+        </w:rPr>
+        <w:t xml:space="preserve"> [</w:t>
+      </w:r>
+      <w:r>
+        <w:rPr>
+          <w:rFonts w:ascii="Consolas" w:eastAsia="Times New Roman" w:hAnsi="Consolas" w:cs="Times New Roman"/>
+          <w:color w:val="9AA83A"/>
+          <w:kern w:val="0"/>
+          <w:sz w:val="21"/>
+          <w:szCs w:val="21"/>
+          <w:lang w:val="en-US" w:eastAsia="ja-JP"/>
+          <w14:ligatures w14:val="none"/>
+        </w:rPr>
+        <w:t>"python"</w:t>
+      </w:r>
+      <w:r>
+        <w:rPr>
+          <w:rFonts w:ascii="Consolas" w:eastAsia="Times New Roman" w:hAnsi="Consolas" w:cs="Times New Roman"/>
+          <w:color w:val="C5C8C6"/>
+          <w:kern w:val="0"/>
+          <w:sz w:val="21"/>
+          <w:szCs w:val="21"/>
+          <w:lang w:val="en-US" w:eastAsia="ja-JP"/>
+          <w14:ligatures w14:val="none"/>
+        </w:rPr>
+        <w:t xml:space="preserve">, </w:t>
+      </w:r>
+      <w:r>
+        <w:rPr>
+          <w:rFonts w:ascii="Consolas" w:eastAsia="Times New Roman" w:hAnsi="Consolas" w:cs="Times New Roman"/>
+          <w:color w:val="9AA83A"/>
+          <w:kern w:val="0"/>
+          <w:sz w:val="21"/>
+          <w:szCs w:val="21"/>
+          <w:lang w:val="en-US" w:eastAsia="ja-JP"/>
+          <w14:ligatures w14:val="none"/>
+        </w:rPr>
+        <w:t>"</w:t>
+      </w:r>
+      <w:proofErr w:type="spellStart"/>
+      <w:r>
+        <w:rPr>
+          <w:rFonts w:ascii="Consolas" w:eastAsia="Times New Roman" w:hAnsi="Consolas" w:cs="Times New Roman"/>
+          <w:color w:val="9AA83A"/>
+          <w:kern w:val="0"/>
+          <w:sz w:val="21"/>
+          <w:szCs w:val="21"/>
+          <w:lang w:val="en-US" w:eastAsia="ja-JP"/>
+          <w14:ligatures w14:val="none"/>
+        </w:rPr>
+        <w:t>src</w:t>
+      </w:r>
+      <w:proofErr w:type="spellEnd"/>
+      <w:r>
+        <w:rPr>
+          <w:rFonts w:ascii="Consolas" w:eastAsia="Times New Roman" w:hAnsi="Consolas" w:cs="Times New Roman"/>
+          <w:color w:val="9AA83A"/>
+          <w:kern w:val="0"/>
+          <w:sz w:val="21"/>
+          <w:szCs w:val="21"/>
+          <w:lang w:val="en-US" w:eastAsia="ja-JP"/>
+          <w14:ligatures w14:val="none"/>
+        </w:rPr>
+        <w:t>/main.py"</w:t>
+      </w:r>
+      <w:r>
+        <w:rPr>
+          <w:rFonts w:ascii="Consolas" w:eastAsia="Times New Roman" w:hAnsi="Consolas" w:cs="Times New Roman"/>
+          <w:color w:val="C5C8C6"/>
+          <w:kern w:val="0"/>
+          <w:sz w:val="21"/>
+          <w:szCs w:val="21"/>
+          <w:lang w:val="en-US" w:eastAsia="ja-JP"/>
+          <w14:ligatures w14:val="none"/>
+        </w:rPr>
+        <w:t xml:space="preserve">] </w:t>
+      </w:r>
+    </w:p>
+    <w:p>
+      <w:pPr>
         <w:rPr>
           <w:rFonts w:ascii="Times New Roman" w:hAnsi="Times New Roman" w:cs="Times New Roman"/>
           <w:sz w:val="28"/>
@@ -968,6 +1611,7 @@
           <w:szCs w:val="28"/>
         </w:rPr>
       </w:pPr>
+      <w:proofErr w:type="spellStart"/>
       <w:r>
         <w:rPr>
           <w:rFonts w:ascii="Times New Roman" w:hAnsi="Times New Roman" w:cs="Times New Roman"/>
@@ -977,6 +1621,7 @@
         </w:rPr>
         <w:t>Dockerfile</w:t>
       </w:r>
+      <w:proofErr w:type="spellEnd"/>
       <w:r>
         <w:rPr>
           <w:rFonts w:ascii="Times New Roman" w:hAnsi="Times New Roman" w:cs="Times New Roman"/>
@@ -1079,6 +1724,1473 @@
     </w:p>
     <w:p>
       <w:pPr>
+        <w:shd w:val="clear" w:color="auto" w:fill="1E1E1E"/>
+        <w:spacing w:after="0" w:line="285" w:lineRule="atLeast"/>
+        <w:rPr>
+          <w:rFonts w:ascii="Consolas" w:eastAsia="Times New Roman" w:hAnsi="Consolas" w:cs="Times New Roman"/>
+          <w:color w:val="C5C8C6"/>
+          <w:kern w:val="0"/>
+          <w:sz w:val="21"/>
+          <w:szCs w:val="21"/>
+          <w:lang w:val="en-US" w:eastAsia="ja-JP"/>
+          <w14:ligatures w14:val="none"/>
+        </w:rPr>
+      </w:pPr>
+      <w:r>
+        <w:rPr>
+          <w:rFonts w:ascii="Consolas" w:eastAsia="Times New Roman" w:hAnsi="Consolas" w:cs="Times New Roman"/>
+          <w:color w:val="676867"/>
+          <w:kern w:val="0"/>
+          <w:sz w:val="21"/>
+          <w:szCs w:val="21"/>
+          <w:lang w:val="en-US" w:eastAsia="ja-JP"/>
+          <w14:ligatures w14:val="none"/>
+        </w:rPr>
+        <w:t>FROM</w:t>
+      </w:r>
+      <w:r>
+        <w:rPr>
+          <w:rFonts w:ascii="Consolas" w:eastAsia="Times New Roman" w:hAnsi="Consolas" w:cs="Times New Roman"/>
+          <w:color w:val="C5C8C6"/>
+          <w:kern w:val="0"/>
+          <w:sz w:val="21"/>
+          <w:szCs w:val="21"/>
+          <w:lang w:val="en-US" w:eastAsia="ja-JP"/>
+          <w14:ligatures w14:val="none"/>
+        </w:rPr>
+        <w:t xml:space="preserve"> maven:3.8.5-openjdk-17-slim </w:t>
+      </w:r>
+    </w:p>
+    <w:p>
+      <w:pPr>
+        <w:shd w:val="clear" w:color="auto" w:fill="1E1E1E"/>
+        <w:spacing w:after="0" w:line="285" w:lineRule="atLeast"/>
+        <w:rPr>
+          <w:rFonts w:ascii="Consolas" w:eastAsia="Times New Roman" w:hAnsi="Consolas" w:cs="Times New Roman"/>
+          <w:color w:val="C5C8C6"/>
+          <w:kern w:val="0"/>
+          <w:sz w:val="21"/>
+          <w:szCs w:val="21"/>
+          <w:lang w:val="en-US" w:eastAsia="ja-JP"/>
+          <w14:ligatures w14:val="none"/>
+        </w:rPr>
+      </w:pPr>
+      <w:r>
+        <w:rPr>
+          <w:rFonts w:ascii="Consolas" w:eastAsia="Times New Roman" w:hAnsi="Consolas" w:cs="Times New Roman"/>
+          <w:color w:val="C5C8C6"/>
+          <w:kern w:val="0"/>
+          <w:sz w:val="21"/>
+          <w:szCs w:val="21"/>
+          <w:lang w:val="en-US" w:eastAsia="ja-JP"/>
+          <w14:ligatures w14:val="none"/>
+        </w:rPr>
+        <w:t> </w:t>
+      </w:r>
+    </w:p>
+    <w:p>
+      <w:pPr>
+        <w:shd w:val="clear" w:color="auto" w:fill="1E1E1E"/>
+        <w:spacing w:after="0" w:line="285" w:lineRule="atLeast"/>
+        <w:rPr>
+          <w:rFonts w:ascii="Consolas" w:eastAsia="Times New Roman" w:hAnsi="Consolas" w:cs="Times New Roman"/>
+          <w:color w:val="C5C8C6"/>
+          <w:kern w:val="0"/>
+          <w:sz w:val="21"/>
+          <w:szCs w:val="21"/>
+          <w:lang w:val="en-US" w:eastAsia="ja-JP"/>
+          <w14:ligatures w14:val="none"/>
+        </w:rPr>
+      </w:pPr>
+      <w:r>
+        <w:rPr>
+          <w:rFonts w:ascii="Consolas" w:eastAsia="Times New Roman" w:hAnsi="Consolas" w:cs="Times New Roman"/>
+          <w:color w:val="676867"/>
+          <w:kern w:val="0"/>
+          <w:sz w:val="21"/>
+          <w:szCs w:val="21"/>
+          <w:lang w:val="en-US" w:eastAsia="ja-JP"/>
+          <w14:ligatures w14:val="none"/>
+        </w:rPr>
+        <w:t>WORKDIR</w:t>
+      </w:r>
+      <w:r>
+        <w:rPr>
+          <w:rFonts w:ascii="Consolas" w:eastAsia="Times New Roman" w:hAnsi="Consolas" w:cs="Times New Roman"/>
+          <w:color w:val="C5C8C6"/>
+          <w:kern w:val="0"/>
+          <w:sz w:val="21"/>
+          <w:szCs w:val="21"/>
+          <w:lang w:val="en-US" w:eastAsia="ja-JP"/>
+          <w14:ligatures w14:val="none"/>
+        </w:rPr>
+        <w:t xml:space="preserve"> /app </w:t>
+      </w:r>
+    </w:p>
+    <w:p>
+      <w:pPr>
+        <w:shd w:val="clear" w:color="auto" w:fill="1E1E1E"/>
+        <w:spacing w:after="0" w:line="285" w:lineRule="atLeast"/>
+        <w:rPr>
+          <w:rFonts w:ascii="Consolas" w:eastAsia="Times New Roman" w:hAnsi="Consolas" w:cs="Times New Roman"/>
+          <w:color w:val="C5C8C6"/>
+          <w:kern w:val="0"/>
+          <w:sz w:val="21"/>
+          <w:szCs w:val="21"/>
+          <w:lang w:val="en-US" w:eastAsia="ja-JP"/>
+          <w14:ligatures w14:val="none"/>
+        </w:rPr>
+      </w:pPr>
+      <w:r>
+        <w:rPr>
+          <w:rFonts w:ascii="Consolas" w:eastAsia="Times New Roman" w:hAnsi="Consolas" w:cs="Times New Roman"/>
+          <w:color w:val="C5C8C6"/>
+          <w:kern w:val="0"/>
+          <w:sz w:val="21"/>
+          <w:szCs w:val="21"/>
+          <w:lang w:val="en-US" w:eastAsia="ja-JP"/>
+          <w14:ligatures w14:val="none"/>
+        </w:rPr>
+        <w:t> </w:t>
+      </w:r>
+    </w:p>
+    <w:p>
+      <w:pPr>
+        <w:shd w:val="clear" w:color="auto" w:fill="1E1E1E"/>
+        <w:spacing w:after="0" w:line="285" w:lineRule="atLeast"/>
+        <w:rPr>
+          <w:rFonts w:ascii="Consolas" w:eastAsia="Times New Roman" w:hAnsi="Consolas" w:cs="Times New Roman"/>
+          <w:color w:val="C5C8C6"/>
+          <w:kern w:val="0"/>
+          <w:sz w:val="21"/>
+          <w:szCs w:val="21"/>
+          <w:lang w:val="en-US" w:eastAsia="ja-JP"/>
+          <w14:ligatures w14:val="none"/>
+        </w:rPr>
+      </w:pPr>
+      <w:r>
+        <w:rPr>
+          <w:rFonts w:ascii="Consolas" w:eastAsia="Times New Roman" w:hAnsi="Consolas" w:cs="Times New Roman"/>
+          <w:color w:val="676867"/>
+          <w:kern w:val="0"/>
+          <w:sz w:val="21"/>
+          <w:szCs w:val="21"/>
+          <w:lang w:val="en-US" w:eastAsia="ja-JP"/>
+          <w14:ligatures w14:val="none"/>
+        </w:rPr>
+        <w:t>COPY</w:t>
+      </w:r>
+      <w:r>
+        <w:rPr>
+          <w:rFonts w:ascii="Consolas" w:eastAsia="Times New Roman" w:hAnsi="Consolas" w:cs="Times New Roman"/>
+          <w:color w:val="C5C8C6"/>
+          <w:kern w:val="0"/>
+          <w:sz w:val="21"/>
+          <w:szCs w:val="21"/>
+          <w:lang w:val="en-US" w:eastAsia="ja-JP"/>
+          <w14:ligatures w14:val="none"/>
+        </w:rPr>
+        <w:t xml:space="preserve"> </w:t>
+      </w:r>
+      <w:proofErr w:type="gramStart"/>
+      <w:r>
+        <w:rPr>
+          <w:rFonts w:ascii="Consolas" w:eastAsia="Times New Roman" w:hAnsi="Consolas" w:cs="Times New Roman"/>
+          <w:color w:val="C5C8C6"/>
+          <w:kern w:val="0"/>
+          <w:sz w:val="21"/>
+          <w:szCs w:val="21"/>
+          <w:lang w:val="en-US" w:eastAsia="ja-JP"/>
+          <w14:ligatures w14:val="none"/>
+        </w:rPr>
+        <w:t>pom.xml .</w:t>
+      </w:r>
+      <w:proofErr w:type="gramEnd"/>
+      <w:r>
+        <w:rPr>
+          <w:rFonts w:ascii="Consolas" w:eastAsia="Times New Roman" w:hAnsi="Consolas" w:cs="Times New Roman"/>
+          <w:color w:val="C5C8C6"/>
+          <w:kern w:val="0"/>
+          <w:sz w:val="21"/>
+          <w:szCs w:val="21"/>
+          <w:lang w:val="en-US" w:eastAsia="ja-JP"/>
+          <w14:ligatures w14:val="none"/>
+        </w:rPr>
+        <w:t xml:space="preserve"> </w:t>
+      </w:r>
+    </w:p>
+    <w:p>
+      <w:pPr>
+        <w:shd w:val="clear" w:color="auto" w:fill="1E1E1E"/>
+        <w:spacing w:after="0" w:line="285" w:lineRule="atLeast"/>
+        <w:rPr>
+          <w:rFonts w:ascii="Consolas" w:eastAsia="Times New Roman" w:hAnsi="Consolas" w:cs="Times New Roman"/>
+          <w:color w:val="C5C8C6"/>
+          <w:kern w:val="0"/>
+          <w:sz w:val="21"/>
+          <w:szCs w:val="21"/>
+          <w:lang w:val="en-US" w:eastAsia="ja-JP"/>
+          <w14:ligatures w14:val="none"/>
+        </w:rPr>
+      </w:pPr>
+    </w:p>
+    <w:p>
+      <w:pPr>
+        <w:shd w:val="clear" w:color="auto" w:fill="1E1E1E"/>
+        <w:spacing w:after="0" w:line="285" w:lineRule="atLeast"/>
+        <w:rPr>
+          <w:rFonts w:ascii="Consolas" w:eastAsia="Times New Roman" w:hAnsi="Consolas" w:cs="Times New Roman"/>
+          <w:color w:val="C5C8C6"/>
+          <w:kern w:val="0"/>
+          <w:sz w:val="21"/>
+          <w:szCs w:val="21"/>
+          <w:lang w:val="en-US" w:eastAsia="ja-JP"/>
+          <w14:ligatures w14:val="none"/>
+        </w:rPr>
+      </w:pPr>
+      <w:r>
+        <w:rPr>
+          <w:rFonts w:ascii="Consolas" w:eastAsia="Times New Roman" w:hAnsi="Consolas" w:cs="Times New Roman"/>
+          <w:color w:val="676867"/>
+          <w:kern w:val="0"/>
+          <w:sz w:val="21"/>
+          <w:szCs w:val="21"/>
+          <w:lang w:val="en-US" w:eastAsia="ja-JP"/>
+          <w14:ligatures w14:val="none"/>
+        </w:rPr>
+        <w:t>COPY</w:t>
+      </w:r>
+      <w:r>
+        <w:rPr>
+          <w:rFonts w:ascii="Consolas" w:eastAsia="Times New Roman" w:hAnsi="Consolas" w:cs="Times New Roman"/>
+          <w:color w:val="C5C8C6"/>
+          <w:kern w:val="0"/>
+          <w:sz w:val="21"/>
+          <w:szCs w:val="21"/>
+          <w:lang w:val="en-US" w:eastAsia="ja-JP"/>
+          <w14:ligatures w14:val="none"/>
+        </w:rPr>
+        <w:t xml:space="preserve"> </w:t>
+      </w:r>
+      <w:proofErr w:type="spellStart"/>
+      <w:proofErr w:type="gramStart"/>
+      <w:r>
+        <w:rPr>
+          <w:rFonts w:ascii="Consolas" w:eastAsia="Times New Roman" w:hAnsi="Consolas" w:cs="Times New Roman"/>
+          <w:color w:val="C5C8C6"/>
+          <w:kern w:val="0"/>
+          <w:sz w:val="21"/>
+          <w:szCs w:val="21"/>
+          <w:lang w:val="en-US" w:eastAsia="ja-JP"/>
+          <w14:ligatures w14:val="none"/>
+        </w:rPr>
+        <w:t>src</w:t>
+      </w:r>
+      <w:proofErr w:type="spellEnd"/>
+      <w:r>
+        <w:rPr>
+          <w:rFonts w:ascii="Consolas" w:eastAsia="Times New Roman" w:hAnsi="Consolas" w:cs="Times New Roman"/>
+          <w:color w:val="C5C8C6"/>
+          <w:kern w:val="0"/>
+          <w:sz w:val="21"/>
+          <w:szCs w:val="21"/>
+          <w:lang w:val="en-US" w:eastAsia="ja-JP"/>
+          <w14:ligatures w14:val="none"/>
+        </w:rPr>
+        <w:t xml:space="preserve"> .</w:t>
+      </w:r>
+      <w:proofErr w:type="gramEnd"/>
+      <w:r>
+        <w:rPr>
+          <w:rFonts w:ascii="Consolas" w:eastAsia="Times New Roman" w:hAnsi="Consolas" w:cs="Times New Roman"/>
+          <w:color w:val="C5C8C6"/>
+          <w:kern w:val="0"/>
+          <w:sz w:val="21"/>
+          <w:szCs w:val="21"/>
+          <w:lang w:val="en-US" w:eastAsia="ja-JP"/>
+          <w14:ligatures w14:val="none"/>
+        </w:rPr>
+        <w:t>/</w:t>
+      </w:r>
+      <w:proofErr w:type="spellStart"/>
+      <w:r>
+        <w:rPr>
+          <w:rFonts w:ascii="Consolas" w:eastAsia="Times New Roman" w:hAnsi="Consolas" w:cs="Times New Roman"/>
+          <w:color w:val="C5C8C6"/>
+          <w:kern w:val="0"/>
+          <w:sz w:val="21"/>
+          <w:szCs w:val="21"/>
+          <w:lang w:val="en-US" w:eastAsia="ja-JP"/>
+          <w14:ligatures w14:val="none"/>
+        </w:rPr>
+        <w:t>src</w:t>
+      </w:r>
+      <w:proofErr w:type="spellEnd"/>
+      <w:r>
+        <w:rPr>
+          <w:rFonts w:ascii="Consolas" w:eastAsia="Times New Roman" w:hAnsi="Consolas" w:cs="Times New Roman"/>
+          <w:color w:val="C5C8C6"/>
+          <w:kern w:val="0"/>
+          <w:sz w:val="21"/>
+          <w:szCs w:val="21"/>
+          <w:lang w:val="en-US" w:eastAsia="ja-JP"/>
+          <w14:ligatures w14:val="none"/>
+        </w:rPr>
+        <w:t xml:space="preserve"> </w:t>
+      </w:r>
+    </w:p>
+    <w:p>
+      <w:pPr>
+        <w:shd w:val="clear" w:color="auto" w:fill="1E1E1E"/>
+        <w:spacing w:after="0" w:line="285" w:lineRule="atLeast"/>
+        <w:rPr>
+          <w:rFonts w:ascii="Consolas" w:eastAsia="Times New Roman" w:hAnsi="Consolas" w:cs="Times New Roman"/>
+          <w:color w:val="C5C8C6"/>
+          <w:kern w:val="0"/>
+          <w:sz w:val="21"/>
+          <w:szCs w:val="21"/>
+          <w:lang w:val="en-US" w:eastAsia="ja-JP"/>
+          <w14:ligatures w14:val="none"/>
+        </w:rPr>
+      </w:pPr>
+      <w:r>
+        <w:rPr>
+          <w:rFonts w:ascii="Consolas" w:eastAsia="Times New Roman" w:hAnsi="Consolas" w:cs="Times New Roman"/>
+          <w:color w:val="C5C8C6"/>
+          <w:kern w:val="0"/>
+          <w:sz w:val="21"/>
+          <w:szCs w:val="21"/>
+          <w:lang w:val="en-US" w:eastAsia="ja-JP"/>
+          <w14:ligatures w14:val="none"/>
+        </w:rPr>
+        <w:t> </w:t>
+      </w:r>
+    </w:p>
+    <w:p>
+      <w:pPr>
+        <w:shd w:val="clear" w:color="auto" w:fill="1E1E1E"/>
+        <w:spacing w:after="0" w:line="285" w:lineRule="atLeast"/>
+        <w:rPr>
+          <w:rFonts w:ascii="Consolas" w:eastAsia="Times New Roman" w:hAnsi="Consolas" w:cs="Times New Roman"/>
+          <w:color w:val="C5C8C6"/>
+          <w:kern w:val="0"/>
+          <w:sz w:val="21"/>
+          <w:szCs w:val="21"/>
+          <w:lang w:val="en-US" w:eastAsia="ja-JP"/>
+          <w14:ligatures w14:val="none"/>
+        </w:rPr>
+      </w:pPr>
+      <w:r>
+        <w:rPr>
+          <w:rFonts w:ascii="Consolas" w:eastAsia="Times New Roman" w:hAnsi="Consolas" w:cs="Times New Roman"/>
+          <w:color w:val="676867"/>
+          <w:kern w:val="0"/>
+          <w:sz w:val="21"/>
+          <w:szCs w:val="21"/>
+          <w:lang w:val="en-US" w:eastAsia="ja-JP"/>
+          <w14:ligatures w14:val="none"/>
+        </w:rPr>
+        <w:lastRenderedPageBreak/>
+        <w:t>RUN</w:t>
+      </w:r>
+      <w:r>
+        <w:rPr>
+          <w:rFonts w:ascii="Consolas" w:eastAsia="Times New Roman" w:hAnsi="Consolas" w:cs="Times New Roman"/>
+          <w:color w:val="C5C8C6"/>
+          <w:kern w:val="0"/>
+          <w:sz w:val="21"/>
+          <w:szCs w:val="21"/>
+          <w:lang w:val="en-US" w:eastAsia="ja-JP"/>
+          <w14:ligatures w14:val="none"/>
+        </w:rPr>
+        <w:t xml:space="preserve"> </w:t>
+      </w:r>
+      <w:proofErr w:type="spellStart"/>
+      <w:r>
+        <w:rPr>
+          <w:rFonts w:ascii="Consolas" w:eastAsia="Times New Roman" w:hAnsi="Consolas" w:cs="Times New Roman"/>
+          <w:color w:val="C5C8C6"/>
+          <w:kern w:val="0"/>
+          <w:sz w:val="21"/>
+          <w:szCs w:val="21"/>
+          <w:lang w:val="en-US" w:eastAsia="ja-JP"/>
+          <w14:ligatures w14:val="none"/>
+        </w:rPr>
+        <w:t>mvn</w:t>
+      </w:r>
+      <w:proofErr w:type="spellEnd"/>
+      <w:r>
+        <w:rPr>
+          <w:rFonts w:ascii="Consolas" w:eastAsia="Times New Roman" w:hAnsi="Consolas" w:cs="Times New Roman"/>
+          <w:color w:val="C5C8C6"/>
+          <w:kern w:val="0"/>
+          <w:sz w:val="21"/>
+          <w:szCs w:val="21"/>
+          <w:lang w:val="en-US" w:eastAsia="ja-JP"/>
+          <w14:ligatures w14:val="none"/>
+        </w:rPr>
+        <w:t xml:space="preserve"> clean package -</w:t>
+      </w:r>
+      <w:proofErr w:type="spellStart"/>
+      <w:r>
+        <w:rPr>
+          <w:rFonts w:ascii="Consolas" w:eastAsia="Times New Roman" w:hAnsi="Consolas" w:cs="Times New Roman"/>
+          <w:color w:val="C5C8C6"/>
+          <w:kern w:val="0"/>
+          <w:sz w:val="21"/>
+          <w:szCs w:val="21"/>
+          <w:lang w:val="en-US" w:eastAsia="ja-JP"/>
+          <w14:ligatures w14:val="none"/>
+        </w:rPr>
+        <w:t>DskipTests</w:t>
+      </w:r>
+      <w:proofErr w:type="spellEnd"/>
+      <w:r>
+        <w:rPr>
+          <w:rFonts w:ascii="Consolas" w:eastAsia="Times New Roman" w:hAnsi="Consolas" w:cs="Times New Roman"/>
+          <w:color w:val="C5C8C6"/>
+          <w:kern w:val="0"/>
+          <w:sz w:val="21"/>
+          <w:szCs w:val="21"/>
+          <w:lang w:val="en-US" w:eastAsia="ja-JP"/>
+          <w14:ligatures w14:val="none"/>
+        </w:rPr>
+        <w:t xml:space="preserve"> </w:t>
+      </w:r>
+    </w:p>
+    <w:p>
+      <w:pPr>
+        <w:shd w:val="clear" w:color="auto" w:fill="1E1E1E"/>
+        <w:spacing w:after="0" w:line="285" w:lineRule="atLeast"/>
+        <w:rPr>
+          <w:rFonts w:ascii="Consolas" w:eastAsia="Times New Roman" w:hAnsi="Consolas" w:cs="Times New Roman"/>
+          <w:color w:val="C5C8C6"/>
+          <w:kern w:val="0"/>
+          <w:sz w:val="21"/>
+          <w:szCs w:val="21"/>
+          <w:lang w:val="en-US" w:eastAsia="ja-JP"/>
+          <w14:ligatures w14:val="none"/>
+        </w:rPr>
+      </w:pPr>
+      <w:r>
+        <w:rPr>
+          <w:rFonts w:ascii="Consolas" w:eastAsia="Times New Roman" w:hAnsi="Consolas" w:cs="Times New Roman"/>
+          <w:color w:val="C5C8C6"/>
+          <w:kern w:val="0"/>
+          <w:sz w:val="21"/>
+          <w:szCs w:val="21"/>
+          <w:lang w:val="en-US" w:eastAsia="ja-JP"/>
+          <w14:ligatures w14:val="none"/>
+        </w:rPr>
+        <w:t> </w:t>
+      </w:r>
+    </w:p>
+    <w:p>
+      <w:pPr>
+        <w:shd w:val="clear" w:color="auto" w:fill="1E1E1E"/>
+        <w:spacing w:after="0" w:line="285" w:lineRule="atLeast"/>
+        <w:rPr>
+          <w:rFonts w:ascii="Consolas" w:eastAsia="Times New Roman" w:hAnsi="Consolas" w:cs="Times New Roman"/>
+          <w:color w:val="C5C8C6"/>
+          <w:kern w:val="0"/>
+          <w:sz w:val="21"/>
+          <w:szCs w:val="21"/>
+          <w:lang w:val="en-US" w:eastAsia="ja-JP"/>
+          <w14:ligatures w14:val="none"/>
+        </w:rPr>
+      </w:pPr>
+      <w:r>
+        <w:rPr>
+          <w:rFonts w:ascii="Consolas" w:eastAsia="Times New Roman" w:hAnsi="Consolas" w:cs="Times New Roman"/>
+          <w:color w:val="676867"/>
+          <w:kern w:val="0"/>
+          <w:sz w:val="21"/>
+          <w:szCs w:val="21"/>
+          <w:lang w:val="en-US" w:eastAsia="ja-JP"/>
+          <w14:ligatures w14:val="none"/>
+        </w:rPr>
+        <w:t>RUN</w:t>
+      </w:r>
+      <w:r>
+        <w:rPr>
+          <w:rFonts w:ascii="Consolas" w:eastAsia="Times New Roman" w:hAnsi="Consolas" w:cs="Times New Roman"/>
+          <w:color w:val="C5C8C6"/>
+          <w:kern w:val="0"/>
+          <w:sz w:val="21"/>
+          <w:szCs w:val="21"/>
+          <w:lang w:val="en-US" w:eastAsia="ja-JP"/>
+          <w14:ligatures w14:val="none"/>
+        </w:rPr>
+        <w:t xml:space="preserve"> cp /app/target/*.jar app.jar </w:t>
+      </w:r>
+    </w:p>
+    <w:p>
+      <w:pPr>
+        <w:shd w:val="clear" w:color="auto" w:fill="1E1E1E"/>
+        <w:spacing w:after="0" w:line="285" w:lineRule="atLeast"/>
+        <w:rPr>
+          <w:rFonts w:ascii="Consolas" w:eastAsia="Times New Roman" w:hAnsi="Consolas" w:cs="Times New Roman"/>
+          <w:color w:val="C5C8C6"/>
+          <w:kern w:val="0"/>
+          <w:sz w:val="21"/>
+          <w:szCs w:val="21"/>
+          <w:lang w:val="en-US" w:eastAsia="ja-JP"/>
+          <w14:ligatures w14:val="none"/>
+        </w:rPr>
+      </w:pPr>
+    </w:p>
+    <w:p>
+      <w:pPr>
+        <w:shd w:val="clear" w:color="auto" w:fill="1E1E1E"/>
+        <w:spacing w:after="0" w:line="285" w:lineRule="atLeast"/>
+        <w:rPr>
+          <w:rFonts w:ascii="Consolas" w:eastAsia="Times New Roman" w:hAnsi="Consolas" w:cs="Times New Roman"/>
+          <w:color w:val="C5C8C6"/>
+          <w:kern w:val="0"/>
+          <w:sz w:val="21"/>
+          <w:szCs w:val="21"/>
+          <w:lang w:val="en-US" w:eastAsia="ja-JP"/>
+          <w14:ligatures w14:val="none"/>
+        </w:rPr>
+      </w:pPr>
+      <w:r>
+        <w:rPr>
+          <w:rFonts w:ascii="Consolas" w:eastAsia="Times New Roman" w:hAnsi="Consolas" w:cs="Times New Roman"/>
+          <w:color w:val="676867"/>
+          <w:kern w:val="0"/>
+          <w:sz w:val="21"/>
+          <w:szCs w:val="21"/>
+          <w:lang w:val="en-US" w:eastAsia="ja-JP"/>
+          <w14:ligatures w14:val="none"/>
+        </w:rPr>
+        <w:t>ENTRYPOINT</w:t>
+      </w:r>
+      <w:r>
+        <w:rPr>
+          <w:rFonts w:ascii="Consolas" w:eastAsia="Times New Roman" w:hAnsi="Consolas" w:cs="Times New Roman"/>
+          <w:color w:val="C5C8C6"/>
+          <w:kern w:val="0"/>
+          <w:sz w:val="21"/>
+          <w:szCs w:val="21"/>
+          <w:lang w:val="en-US" w:eastAsia="ja-JP"/>
+          <w14:ligatures w14:val="none"/>
+        </w:rPr>
+        <w:t xml:space="preserve"> [</w:t>
+      </w:r>
+      <w:r>
+        <w:rPr>
+          <w:rFonts w:ascii="Consolas" w:eastAsia="Times New Roman" w:hAnsi="Consolas" w:cs="Times New Roman"/>
+          <w:color w:val="9AA83A"/>
+          <w:kern w:val="0"/>
+          <w:sz w:val="21"/>
+          <w:szCs w:val="21"/>
+          <w:lang w:val="en-US" w:eastAsia="ja-JP"/>
+          <w14:ligatures w14:val="none"/>
+        </w:rPr>
+        <w:t>"java"</w:t>
+      </w:r>
+      <w:r>
+        <w:rPr>
+          <w:rFonts w:ascii="Consolas" w:eastAsia="Times New Roman" w:hAnsi="Consolas" w:cs="Times New Roman"/>
+          <w:color w:val="C5C8C6"/>
+          <w:kern w:val="0"/>
+          <w:sz w:val="21"/>
+          <w:szCs w:val="21"/>
+          <w:lang w:val="en-US" w:eastAsia="ja-JP"/>
+          <w14:ligatures w14:val="none"/>
+        </w:rPr>
+        <w:t xml:space="preserve">, </w:t>
+      </w:r>
+      <w:r>
+        <w:rPr>
+          <w:rFonts w:ascii="Consolas" w:eastAsia="Times New Roman" w:hAnsi="Consolas" w:cs="Times New Roman"/>
+          <w:color w:val="9AA83A"/>
+          <w:kern w:val="0"/>
+          <w:sz w:val="21"/>
+          <w:szCs w:val="21"/>
+          <w:lang w:val="en-US" w:eastAsia="ja-JP"/>
+          <w14:ligatures w14:val="none"/>
+        </w:rPr>
+        <w:t>"-jar"</w:t>
+      </w:r>
+      <w:r>
+        <w:rPr>
+          <w:rFonts w:ascii="Consolas" w:eastAsia="Times New Roman" w:hAnsi="Consolas" w:cs="Times New Roman"/>
+          <w:color w:val="C5C8C6"/>
+          <w:kern w:val="0"/>
+          <w:sz w:val="21"/>
+          <w:szCs w:val="21"/>
+          <w:lang w:val="en-US" w:eastAsia="ja-JP"/>
+          <w14:ligatures w14:val="none"/>
+        </w:rPr>
+        <w:t xml:space="preserve">, </w:t>
+      </w:r>
+      <w:r>
+        <w:rPr>
+          <w:rFonts w:ascii="Consolas" w:eastAsia="Times New Roman" w:hAnsi="Consolas" w:cs="Times New Roman"/>
+          <w:color w:val="9AA83A"/>
+          <w:kern w:val="0"/>
+          <w:sz w:val="21"/>
+          <w:szCs w:val="21"/>
+          <w:lang w:val="en-US" w:eastAsia="ja-JP"/>
+          <w14:ligatures w14:val="none"/>
+        </w:rPr>
+        <w:t>"app.jar"</w:t>
+      </w:r>
+      <w:r>
+        <w:rPr>
+          <w:rFonts w:ascii="Consolas" w:eastAsia="Times New Roman" w:hAnsi="Consolas" w:cs="Times New Roman"/>
+          <w:color w:val="C5C8C6"/>
+          <w:kern w:val="0"/>
+          <w:sz w:val="21"/>
+          <w:szCs w:val="21"/>
+          <w:lang w:val="en-US" w:eastAsia="ja-JP"/>
+          <w14:ligatures w14:val="none"/>
+        </w:rPr>
+        <w:t xml:space="preserve">] </w:t>
+      </w:r>
+    </w:p>
+    <w:p>
+      <w:pPr>
+        <w:shd w:val="clear" w:color="auto" w:fill="1E1E1E"/>
+        <w:spacing w:after="0" w:line="285" w:lineRule="atLeast"/>
+        <w:rPr>
+          <w:rFonts w:ascii="Consolas" w:eastAsia="Times New Roman" w:hAnsi="Consolas" w:cs="Times New Roman"/>
+          <w:color w:val="C5C8C6"/>
+          <w:kern w:val="0"/>
+          <w:sz w:val="21"/>
+          <w:szCs w:val="21"/>
+          <w:lang w:val="en-US" w:eastAsia="ja-JP"/>
+          <w14:ligatures w14:val="none"/>
+        </w:rPr>
+      </w:pPr>
+    </w:p>
+    <w:p>
+      <w:pPr>
+        <w:shd w:val="clear" w:color="auto" w:fill="1E1E1E"/>
+        <w:spacing w:after="0" w:line="285" w:lineRule="atLeast"/>
+        <w:rPr>
+          <w:rFonts w:ascii="Consolas" w:eastAsia="Times New Roman" w:hAnsi="Consolas" w:cs="Times New Roman"/>
+          <w:color w:val="C5C8C6"/>
+          <w:kern w:val="0"/>
+          <w:sz w:val="21"/>
+          <w:szCs w:val="21"/>
+          <w:lang w:eastAsia="ja-JP"/>
+          <w14:ligatures w14:val="none"/>
+        </w:rPr>
+      </w:pPr>
+      <w:r>
+        <w:rPr>
+          <w:rFonts w:ascii="Consolas" w:eastAsia="Times New Roman" w:hAnsi="Consolas" w:cs="Times New Roman"/>
+          <w:color w:val="676867"/>
+          <w:kern w:val="0"/>
+          <w:sz w:val="21"/>
+          <w:szCs w:val="21"/>
+          <w:lang w:eastAsia="ja-JP"/>
+          <w14:ligatures w14:val="none"/>
+        </w:rPr>
+        <w:t>EXPOSE</w:t>
+      </w:r>
+      <w:r>
+        <w:rPr>
+          <w:rFonts w:ascii="Consolas" w:eastAsia="Times New Roman" w:hAnsi="Consolas" w:cs="Times New Roman"/>
+          <w:color w:val="C5C8C6"/>
+          <w:kern w:val="0"/>
+          <w:sz w:val="21"/>
+          <w:szCs w:val="21"/>
+          <w:lang w:eastAsia="ja-JP"/>
+          <w14:ligatures w14:val="none"/>
+        </w:rPr>
+        <w:t xml:space="preserve"> 8080</w:t>
+      </w:r>
+    </w:p>
+    <w:p>
+      <w:pPr>
+        <w:rPr>
+          <w:rFonts w:ascii="Times New Roman" w:hAnsi="Times New Roman" w:cs="Times New Roman"/>
+          <w:sz w:val="28"/>
+          <w:szCs w:val="28"/>
+          <w:lang w:val="en-US"/>
+        </w:rPr>
+      </w:pPr>
+    </w:p>
+    <w:p>
+      <w:pPr>
+        <w:shd w:val="clear" w:color="auto" w:fill="1E1E1E"/>
+        <w:spacing w:after="0" w:line="285" w:lineRule="atLeast"/>
+        <w:rPr>
+          <w:rFonts w:ascii="Consolas" w:eastAsia="Times New Roman" w:hAnsi="Consolas" w:cs="Times New Roman"/>
+          <w:color w:val="C5C8C6"/>
+          <w:kern w:val="0"/>
+          <w:sz w:val="21"/>
+          <w:szCs w:val="21"/>
+          <w:lang w:val="en-US" w:eastAsia="ja-JP"/>
+          <w14:ligatures w14:val="none"/>
+        </w:rPr>
+      </w:pPr>
+      <w:r>
+        <w:rPr>
+          <w:rFonts w:ascii="Consolas" w:eastAsia="Times New Roman" w:hAnsi="Consolas" w:cs="Times New Roman"/>
+          <w:color w:val="676867"/>
+          <w:kern w:val="0"/>
+          <w:sz w:val="21"/>
+          <w:szCs w:val="21"/>
+          <w:lang w:val="en-US" w:eastAsia="ja-JP"/>
+          <w14:ligatures w14:val="none"/>
+        </w:rPr>
+        <w:t>FROM</w:t>
+      </w:r>
+      <w:r>
+        <w:rPr>
+          <w:rFonts w:ascii="Consolas" w:eastAsia="Times New Roman" w:hAnsi="Consolas" w:cs="Times New Roman"/>
+          <w:color w:val="C5C8C6"/>
+          <w:kern w:val="0"/>
+          <w:sz w:val="21"/>
+          <w:szCs w:val="21"/>
+          <w:lang w:val="en-US" w:eastAsia="ja-JP"/>
+          <w14:ligatures w14:val="none"/>
+        </w:rPr>
+        <w:t xml:space="preserve"> maven:3.8.5-openjdk-17-slim </w:t>
+      </w:r>
+      <w:r>
+        <w:rPr>
+          <w:rFonts w:ascii="Consolas" w:eastAsia="Times New Roman" w:hAnsi="Consolas" w:cs="Times New Roman"/>
+          <w:color w:val="676867"/>
+          <w:kern w:val="0"/>
+          <w:sz w:val="21"/>
+          <w:szCs w:val="21"/>
+          <w:lang w:val="en-US" w:eastAsia="ja-JP"/>
+          <w14:ligatures w14:val="none"/>
+        </w:rPr>
+        <w:t>AS</w:t>
+      </w:r>
+      <w:r>
+        <w:rPr>
+          <w:rFonts w:ascii="Consolas" w:eastAsia="Times New Roman" w:hAnsi="Consolas" w:cs="Times New Roman"/>
+          <w:color w:val="C5C8C6"/>
+          <w:kern w:val="0"/>
+          <w:sz w:val="21"/>
+          <w:szCs w:val="21"/>
+          <w:lang w:val="en-US" w:eastAsia="ja-JP"/>
+          <w14:ligatures w14:val="none"/>
+        </w:rPr>
+        <w:t xml:space="preserve"> build </w:t>
+      </w:r>
+    </w:p>
+    <w:p>
+      <w:pPr>
+        <w:shd w:val="clear" w:color="auto" w:fill="1E1E1E"/>
+        <w:spacing w:after="0" w:line="285" w:lineRule="atLeast"/>
+        <w:rPr>
+          <w:rFonts w:ascii="Consolas" w:eastAsia="Times New Roman" w:hAnsi="Consolas" w:cs="Times New Roman"/>
+          <w:color w:val="C5C8C6"/>
+          <w:kern w:val="0"/>
+          <w:sz w:val="21"/>
+          <w:szCs w:val="21"/>
+          <w:lang w:val="en-US" w:eastAsia="ja-JP"/>
+          <w14:ligatures w14:val="none"/>
+        </w:rPr>
+      </w:pPr>
+    </w:p>
+    <w:p>
+      <w:pPr>
+        <w:shd w:val="clear" w:color="auto" w:fill="1E1E1E"/>
+        <w:spacing w:after="0" w:line="285" w:lineRule="atLeast"/>
+        <w:rPr>
+          <w:rFonts w:ascii="Consolas" w:eastAsia="Times New Roman" w:hAnsi="Consolas" w:cs="Times New Roman"/>
+          <w:color w:val="C5C8C6"/>
+          <w:kern w:val="0"/>
+          <w:sz w:val="21"/>
+          <w:szCs w:val="21"/>
+          <w:lang w:val="en-US" w:eastAsia="ja-JP"/>
+          <w14:ligatures w14:val="none"/>
+        </w:rPr>
+      </w:pPr>
+      <w:r>
+        <w:rPr>
+          <w:rFonts w:ascii="Consolas" w:eastAsia="Times New Roman" w:hAnsi="Consolas" w:cs="Times New Roman"/>
+          <w:color w:val="676867"/>
+          <w:kern w:val="0"/>
+          <w:sz w:val="21"/>
+          <w:szCs w:val="21"/>
+          <w:lang w:val="en-US" w:eastAsia="ja-JP"/>
+          <w14:ligatures w14:val="none"/>
+        </w:rPr>
+        <w:t>WORKDIR</w:t>
+      </w:r>
+      <w:r>
+        <w:rPr>
+          <w:rFonts w:ascii="Consolas" w:eastAsia="Times New Roman" w:hAnsi="Consolas" w:cs="Times New Roman"/>
+          <w:color w:val="C5C8C6"/>
+          <w:kern w:val="0"/>
+          <w:sz w:val="21"/>
+          <w:szCs w:val="21"/>
+          <w:lang w:val="en-US" w:eastAsia="ja-JP"/>
+          <w14:ligatures w14:val="none"/>
+        </w:rPr>
+        <w:t xml:space="preserve"> /app </w:t>
+      </w:r>
+    </w:p>
+    <w:p>
+      <w:pPr>
+        <w:shd w:val="clear" w:color="auto" w:fill="1E1E1E"/>
+        <w:spacing w:after="0" w:line="285" w:lineRule="atLeast"/>
+        <w:rPr>
+          <w:rFonts w:ascii="Consolas" w:eastAsia="Times New Roman" w:hAnsi="Consolas" w:cs="Times New Roman"/>
+          <w:color w:val="C5C8C6"/>
+          <w:kern w:val="0"/>
+          <w:sz w:val="21"/>
+          <w:szCs w:val="21"/>
+          <w:lang w:val="en-US" w:eastAsia="ja-JP"/>
+          <w14:ligatures w14:val="none"/>
+        </w:rPr>
+      </w:pPr>
+    </w:p>
+    <w:p>
+      <w:pPr>
+        <w:shd w:val="clear" w:color="auto" w:fill="1E1E1E"/>
+        <w:spacing w:after="0" w:line="285" w:lineRule="atLeast"/>
+        <w:rPr>
+          <w:rFonts w:ascii="Consolas" w:eastAsia="Times New Roman" w:hAnsi="Consolas" w:cs="Times New Roman"/>
+          <w:color w:val="C5C8C6"/>
+          <w:kern w:val="0"/>
+          <w:sz w:val="21"/>
+          <w:szCs w:val="21"/>
+          <w:lang w:val="en-US" w:eastAsia="ja-JP"/>
+          <w14:ligatures w14:val="none"/>
+        </w:rPr>
+      </w:pPr>
+      <w:r>
+        <w:rPr>
+          <w:rFonts w:ascii="Consolas" w:eastAsia="Times New Roman" w:hAnsi="Consolas" w:cs="Times New Roman"/>
+          <w:color w:val="676867"/>
+          <w:kern w:val="0"/>
+          <w:sz w:val="21"/>
+          <w:szCs w:val="21"/>
+          <w:lang w:val="en-US" w:eastAsia="ja-JP"/>
+          <w14:ligatures w14:val="none"/>
+        </w:rPr>
+        <w:t>COPY</w:t>
+      </w:r>
+      <w:r>
+        <w:rPr>
+          <w:rFonts w:ascii="Consolas" w:eastAsia="Times New Roman" w:hAnsi="Consolas" w:cs="Times New Roman"/>
+          <w:color w:val="C5C8C6"/>
+          <w:kern w:val="0"/>
+          <w:sz w:val="21"/>
+          <w:szCs w:val="21"/>
+          <w:lang w:val="en-US" w:eastAsia="ja-JP"/>
+          <w14:ligatures w14:val="none"/>
+        </w:rPr>
+        <w:t xml:space="preserve"> </w:t>
+      </w:r>
+      <w:proofErr w:type="gramStart"/>
+      <w:r>
+        <w:rPr>
+          <w:rFonts w:ascii="Consolas" w:eastAsia="Times New Roman" w:hAnsi="Consolas" w:cs="Times New Roman"/>
+          <w:color w:val="C5C8C6"/>
+          <w:kern w:val="0"/>
+          <w:sz w:val="21"/>
+          <w:szCs w:val="21"/>
+          <w:lang w:val="en-US" w:eastAsia="ja-JP"/>
+          <w14:ligatures w14:val="none"/>
+        </w:rPr>
+        <w:t>pom.xml .</w:t>
+      </w:r>
+      <w:proofErr w:type="gramEnd"/>
+      <w:r>
+        <w:rPr>
+          <w:rFonts w:ascii="Consolas" w:eastAsia="Times New Roman" w:hAnsi="Consolas" w:cs="Times New Roman"/>
+          <w:color w:val="C5C8C6"/>
+          <w:kern w:val="0"/>
+          <w:sz w:val="21"/>
+          <w:szCs w:val="21"/>
+          <w:lang w:val="en-US" w:eastAsia="ja-JP"/>
+          <w14:ligatures w14:val="none"/>
+        </w:rPr>
+        <w:t xml:space="preserve"> </w:t>
+      </w:r>
+    </w:p>
+    <w:p>
+      <w:pPr>
+        <w:shd w:val="clear" w:color="auto" w:fill="1E1E1E"/>
+        <w:spacing w:after="0" w:line="285" w:lineRule="atLeast"/>
+        <w:rPr>
+          <w:rFonts w:ascii="Consolas" w:eastAsia="Times New Roman" w:hAnsi="Consolas" w:cs="Times New Roman"/>
+          <w:color w:val="C5C8C6"/>
+          <w:kern w:val="0"/>
+          <w:sz w:val="21"/>
+          <w:szCs w:val="21"/>
+          <w:lang w:val="en-US" w:eastAsia="ja-JP"/>
+          <w14:ligatures w14:val="none"/>
+        </w:rPr>
+      </w:pPr>
+    </w:p>
+    <w:p>
+      <w:pPr>
+        <w:shd w:val="clear" w:color="auto" w:fill="1E1E1E"/>
+        <w:spacing w:after="0" w:line="285" w:lineRule="atLeast"/>
+        <w:rPr>
+          <w:rFonts w:ascii="Consolas" w:eastAsia="Times New Roman" w:hAnsi="Consolas" w:cs="Times New Roman"/>
+          <w:color w:val="C5C8C6"/>
+          <w:kern w:val="0"/>
+          <w:sz w:val="21"/>
+          <w:szCs w:val="21"/>
+          <w:lang w:val="en-US" w:eastAsia="ja-JP"/>
+          <w14:ligatures w14:val="none"/>
+        </w:rPr>
+      </w:pPr>
+      <w:r>
+        <w:rPr>
+          <w:rFonts w:ascii="Consolas" w:eastAsia="Times New Roman" w:hAnsi="Consolas" w:cs="Times New Roman"/>
+          <w:color w:val="676867"/>
+          <w:kern w:val="0"/>
+          <w:sz w:val="21"/>
+          <w:szCs w:val="21"/>
+          <w:lang w:val="en-US" w:eastAsia="ja-JP"/>
+          <w14:ligatures w14:val="none"/>
+        </w:rPr>
+        <w:t>COPY</w:t>
+      </w:r>
+      <w:r>
+        <w:rPr>
+          <w:rFonts w:ascii="Consolas" w:eastAsia="Times New Roman" w:hAnsi="Consolas" w:cs="Times New Roman"/>
+          <w:color w:val="C5C8C6"/>
+          <w:kern w:val="0"/>
+          <w:sz w:val="21"/>
+          <w:szCs w:val="21"/>
+          <w:lang w:val="en-US" w:eastAsia="ja-JP"/>
+          <w14:ligatures w14:val="none"/>
+        </w:rPr>
+        <w:t xml:space="preserve"> </w:t>
+      </w:r>
+      <w:proofErr w:type="spellStart"/>
+      <w:proofErr w:type="gramStart"/>
+      <w:r>
+        <w:rPr>
+          <w:rFonts w:ascii="Consolas" w:eastAsia="Times New Roman" w:hAnsi="Consolas" w:cs="Times New Roman"/>
+          <w:color w:val="C5C8C6"/>
+          <w:kern w:val="0"/>
+          <w:sz w:val="21"/>
+          <w:szCs w:val="21"/>
+          <w:lang w:val="en-US" w:eastAsia="ja-JP"/>
+          <w14:ligatures w14:val="none"/>
+        </w:rPr>
+        <w:t>src</w:t>
+      </w:r>
+      <w:proofErr w:type="spellEnd"/>
+      <w:r>
+        <w:rPr>
+          <w:rFonts w:ascii="Consolas" w:eastAsia="Times New Roman" w:hAnsi="Consolas" w:cs="Times New Roman"/>
+          <w:color w:val="C5C8C6"/>
+          <w:kern w:val="0"/>
+          <w:sz w:val="21"/>
+          <w:szCs w:val="21"/>
+          <w:lang w:val="en-US" w:eastAsia="ja-JP"/>
+          <w14:ligatures w14:val="none"/>
+        </w:rPr>
+        <w:t xml:space="preserve"> .</w:t>
+      </w:r>
+      <w:proofErr w:type="gramEnd"/>
+      <w:r>
+        <w:rPr>
+          <w:rFonts w:ascii="Consolas" w:eastAsia="Times New Roman" w:hAnsi="Consolas" w:cs="Times New Roman"/>
+          <w:color w:val="C5C8C6"/>
+          <w:kern w:val="0"/>
+          <w:sz w:val="21"/>
+          <w:szCs w:val="21"/>
+          <w:lang w:val="en-US" w:eastAsia="ja-JP"/>
+          <w14:ligatures w14:val="none"/>
+        </w:rPr>
+        <w:t>/</w:t>
+      </w:r>
+      <w:proofErr w:type="spellStart"/>
+      <w:r>
+        <w:rPr>
+          <w:rFonts w:ascii="Consolas" w:eastAsia="Times New Roman" w:hAnsi="Consolas" w:cs="Times New Roman"/>
+          <w:color w:val="C5C8C6"/>
+          <w:kern w:val="0"/>
+          <w:sz w:val="21"/>
+          <w:szCs w:val="21"/>
+          <w:lang w:val="en-US" w:eastAsia="ja-JP"/>
+          <w14:ligatures w14:val="none"/>
+        </w:rPr>
+        <w:t>src</w:t>
+      </w:r>
+      <w:proofErr w:type="spellEnd"/>
+      <w:r>
+        <w:rPr>
+          <w:rFonts w:ascii="Consolas" w:eastAsia="Times New Roman" w:hAnsi="Consolas" w:cs="Times New Roman"/>
+          <w:color w:val="C5C8C6"/>
+          <w:kern w:val="0"/>
+          <w:sz w:val="21"/>
+          <w:szCs w:val="21"/>
+          <w:lang w:val="en-US" w:eastAsia="ja-JP"/>
+          <w14:ligatures w14:val="none"/>
+        </w:rPr>
+        <w:t xml:space="preserve"> </w:t>
+      </w:r>
+    </w:p>
+    <w:p>
+      <w:pPr>
+        <w:shd w:val="clear" w:color="auto" w:fill="1E1E1E"/>
+        <w:spacing w:after="0" w:line="285" w:lineRule="atLeast"/>
+        <w:rPr>
+          <w:rFonts w:ascii="Consolas" w:eastAsia="Times New Roman" w:hAnsi="Consolas" w:cs="Times New Roman"/>
+          <w:color w:val="C5C8C6"/>
+          <w:kern w:val="0"/>
+          <w:sz w:val="21"/>
+          <w:szCs w:val="21"/>
+          <w:lang w:val="en-US" w:eastAsia="ja-JP"/>
+          <w14:ligatures w14:val="none"/>
+        </w:rPr>
+      </w:pPr>
+    </w:p>
+    <w:p>
+      <w:pPr>
+        <w:shd w:val="clear" w:color="auto" w:fill="1E1E1E"/>
+        <w:spacing w:after="0" w:line="285" w:lineRule="atLeast"/>
+        <w:rPr>
+          <w:rFonts w:ascii="Consolas" w:eastAsia="Times New Roman" w:hAnsi="Consolas" w:cs="Times New Roman"/>
+          <w:color w:val="C5C8C6"/>
+          <w:kern w:val="0"/>
+          <w:sz w:val="21"/>
+          <w:szCs w:val="21"/>
+          <w:lang w:val="en-US" w:eastAsia="ja-JP"/>
+          <w14:ligatures w14:val="none"/>
+        </w:rPr>
+      </w:pPr>
+      <w:r>
+        <w:rPr>
+          <w:rFonts w:ascii="Consolas" w:eastAsia="Times New Roman" w:hAnsi="Consolas" w:cs="Times New Roman"/>
+          <w:color w:val="676867"/>
+          <w:kern w:val="0"/>
+          <w:sz w:val="21"/>
+          <w:szCs w:val="21"/>
+          <w:lang w:val="en-US" w:eastAsia="ja-JP"/>
+          <w14:ligatures w14:val="none"/>
+        </w:rPr>
+        <w:t>RUN</w:t>
+      </w:r>
+      <w:r>
+        <w:rPr>
+          <w:rFonts w:ascii="Consolas" w:eastAsia="Times New Roman" w:hAnsi="Consolas" w:cs="Times New Roman"/>
+          <w:color w:val="C5C8C6"/>
+          <w:kern w:val="0"/>
+          <w:sz w:val="21"/>
+          <w:szCs w:val="21"/>
+          <w:lang w:val="en-US" w:eastAsia="ja-JP"/>
+          <w14:ligatures w14:val="none"/>
+        </w:rPr>
+        <w:t xml:space="preserve"> </w:t>
+      </w:r>
+      <w:proofErr w:type="spellStart"/>
+      <w:r>
+        <w:rPr>
+          <w:rFonts w:ascii="Consolas" w:eastAsia="Times New Roman" w:hAnsi="Consolas" w:cs="Times New Roman"/>
+          <w:color w:val="C5C8C6"/>
+          <w:kern w:val="0"/>
+          <w:sz w:val="21"/>
+          <w:szCs w:val="21"/>
+          <w:lang w:val="en-US" w:eastAsia="ja-JP"/>
+          <w14:ligatures w14:val="none"/>
+        </w:rPr>
+        <w:t>mvn</w:t>
+      </w:r>
+      <w:proofErr w:type="spellEnd"/>
+      <w:r>
+        <w:rPr>
+          <w:rFonts w:ascii="Consolas" w:eastAsia="Times New Roman" w:hAnsi="Consolas" w:cs="Times New Roman"/>
+          <w:color w:val="C5C8C6"/>
+          <w:kern w:val="0"/>
+          <w:sz w:val="21"/>
+          <w:szCs w:val="21"/>
+          <w:lang w:val="en-US" w:eastAsia="ja-JP"/>
+          <w14:ligatures w14:val="none"/>
+        </w:rPr>
+        <w:t xml:space="preserve"> clean package -</w:t>
+      </w:r>
+      <w:proofErr w:type="spellStart"/>
+      <w:r>
+        <w:rPr>
+          <w:rFonts w:ascii="Consolas" w:eastAsia="Times New Roman" w:hAnsi="Consolas" w:cs="Times New Roman"/>
+          <w:color w:val="C5C8C6"/>
+          <w:kern w:val="0"/>
+          <w:sz w:val="21"/>
+          <w:szCs w:val="21"/>
+          <w:lang w:val="en-US" w:eastAsia="ja-JP"/>
+          <w14:ligatures w14:val="none"/>
+        </w:rPr>
+        <w:t>DskipTests</w:t>
+      </w:r>
+      <w:proofErr w:type="spellEnd"/>
+      <w:r>
+        <w:rPr>
+          <w:rFonts w:ascii="Consolas" w:eastAsia="Times New Roman" w:hAnsi="Consolas" w:cs="Times New Roman"/>
+          <w:color w:val="C5C8C6"/>
+          <w:kern w:val="0"/>
+          <w:sz w:val="21"/>
+          <w:szCs w:val="21"/>
+          <w:lang w:val="en-US" w:eastAsia="ja-JP"/>
+          <w14:ligatures w14:val="none"/>
+        </w:rPr>
+        <w:t xml:space="preserve"> </w:t>
+      </w:r>
+    </w:p>
+    <w:p>
+      <w:pPr>
+        <w:shd w:val="clear" w:color="auto" w:fill="1E1E1E"/>
+        <w:spacing w:after="0" w:line="285" w:lineRule="atLeast"/>
+        <w:rPr>
+          <w:rFonts w:ascii="Consolas" w:eastAsia="Times New Roman" w:hAnsi="Consolas" w:cs="Times New Roman"/>
+          <w:color w:val="C5C8C6"/>
+          <w:kern w:val="0"/>
+          <w:sz w:val="21"/>
+          <w:szCs w:val="21"/>
+          <w:lang w:val="en-US" w:eastAsia="ja-JP"/>
+          <w14:ligatures w14:val="none"/>
+        </w:rPr>
+      </w:pPr>
+    </w:p>
+    <w:p>
+      <w:pPr>
+        <w:shd w:val="clear" w:color="auto" w:fill="1E1E1E"/>
+        <w:spacing w:after="0" w:line="285" w:lineRule="atLeast"/>
+        <w:rPr>
+          <w:rFonts w:ascii="Consolas" w:eastAsia="Times New Roman" w:hAnsi="Consolas" w:cs="Times New Roman"/>
+          <w:color w:val="C5C8C6"/>
+          <w:kern w:val="0"/>
+          <w:sz w:val="21"/>
+          <w:szCs w:val="21"/>
+          <w:lang w:val="en-US" w:eastAsia="ja-JP"/>
+          <w14:ligatures w14:val="none"/>
+        </w:rPr>
+      </w:pPr>
+      <w:r>
+        <w:rPr>
+          <w:rFonts w:ascii="Consolas" w:eastAsia="Times New Roman" w:hAnsi="Consolas" w:cs="Times New Roman"/>
+          <w:color w:val="676867"/>
+          <w:kern w:val="0"/>
+          <w:sz w:val="21"/>
+          <w:szCs w:val="21"/>
+          <w:lang w:val="en-US" w:eastAsia="ja-JP"/>
+          <w14:ligatures w14:val="none"/>
+        </w:rPr>
+        <w:t>FROM</w:t>
+      </w:r>
+      <w:r>
+        <w:rPr>
+          <w:rFonts w:ascii="Consolas" w:eastAsia="Times New Roman" w:hAnsi="Consolas" w:cs="Times New Roman"/>
+          <w:color w:val="C5C8C6"/>
+          <w:kern w:val="0"/>
+          <w:sz w:val="21"/>
+          <w:szCs w:val="21"/>
+          <w:lang w:val="en-US" w:eastAsia="ja-JP"/>
+          <w14:ligatures w14:val="none"/>
+        </w:rPr>
+        <w:t xml:space="preserve"> eclipse-temurin:17.0.14_7-jre-jammy </w:t>
+      </w:r>
+    </w:p>
+    <w:p>
+      <w:pPr>
+        <w:shd w:val="clear" w:color="auto" w:fill="1E1E1E"/>
+        <w:spacing w:after="0" w:line="285" w:lineRule="atLeast"/>
+        <w:rPr>
+          <w:rFonts w:ascii="Consolas" w:eastAsia="Times New Roman" w:hAnsi="Consolas" w:cs="Times New Roman"/>
+          <w:color w:val="C5C8C6"/>
+          <w:kern w:val="0"/>
+          <w:sz w:val="21"/>
+          <w:szCs w:val="21"/>
+          <w:lang w:val="en-US" w:eastAsia="ja-JP"/>
+          <w14:ligatures w14:val="none"/>
+        </w:rPr>
+      </w:pPr>
+    </w:p>
+    <w:p>
+      <w:pPr>
+        <w:shd w:val="clear" w:color="auto" w:fill="1E1E1E"/>
+        <w:spacing w:after="0" w:line="285" w:lineRule="atLeast"/>
+        <w:rPr>
+          <w:rFonts w:ascii="Consolas" w:eastAsia="Times New Roman" w:hAnsi="Consolas" w:cs="Times New Roman"/>
+          <w:color w:val="C5C8C6"/>
+          <w:kern w:val="0"/>
+          <w:sz w:val="21"/>
+          <w:szCs w:val="21"/>
+          <w:lang w:val="en-US" w:eastAsia="ja-JP"/>
+          <w14:ligatures w14:val="none"/>
+        </w:rPr>
+      </w:pPr>
+      <w:r>
+        <w:rPr>
+          <w:rFonts w:ascii="Consolas" w:eastAsia="Times New Roman" w:hAnsi="Consolas" w:cs="Times New Roman"/>
+          <w:color w:val="676867"/>
+          <w:kern w:val="0"/>
+          <w:sz w:val="21"/>
+          <w:szCs w:val="21"/>
+          <w:lang w:val="en-US" w:eastAsia="ja-JP"/>
+          <w14:ligatures w14:val="none"/>
+        </w:rPr>
+        <w:t>WORKDIR</w:t>
+      </w:r>
+      <w:r>
+        <w:rPr>
+          <w:rFonts w:ascii="Consolas" w:eastAsia="Times New Roman" w:hAnsi="Consolas" w:cs="Times New Roman"/>
+          <w:color w:val="C5C8C6"/>
+          <w:kern w:val="0"/>
+          <w:sz w:val="21"/>
+          <w:szCs w:val="21"/>
+          <w:lang w:val="en-US" w:eastAsia="ja-JP"/>
+          <w14:ligatures w14:val="none"/>
+        </w:rPr>
+        <w:t xml:space="preserve"> /app </w:t>
+      </w:r>
+    </w:p>
+    <w:p>
+      <w:pPr>
+        <w:shd w:val="clear" w:color="auto" w:fill="1E1E1E"/>
+        <w:spacing w:after="0" w:line="285" w:lineRule="atLeast"/>
+        <w:rPr>
+          <w:rFonts w:ascii="Consolas" w:eastAsia="Times New Roman" w:hAnsi="Consolas" w:cs="Times New Roman"/>
+          <w:color w:val="C5C8C6"/>
+          <w:kern w:val="0"/>
+          <w:sz w:val="21"/>
+          <w:szCs w:val="21"/>
+          <w:lang w:val="en-US" w:eastAsia="ja-JP"/>
+          <w14:ligatures w14:val="none"/>
+        </w:rPr>
+      </w:pPr>
+    </w:p>
+    <w:p>
+      <w:pPr>
+        <w:shd w:val="clear" w:color="auto" w:fill="1E1E1E"/>
+        <w:spacing w:after="0" w:line="285" w:lineRule="atLeast"/>
+        <w:rPr>
+          <w:rFonts w:ascii="Consolas" w:eastAsia="Times New Roman" w:hAnsi="Consolas" w:cs="Times New Roman"/>
+          <w:color w:val="C5C8C6"/>
+          <w:kern w:val="0"/>
+          <w:sz w:val="21"/>
+          <w:szCs w:val="21"/>
+          <w:lang w:val="en-US" w:eastAsia="ja-JP"/>
+          <w14:ligatures w14:val="none"/>
+        </w:rPr>
+      </w:pPr>
+      <w:r>
+        <w:rPr>
+          <w:rFonts w:ascii="Consolas" w:eastAsia="Times New Roman" w:hAnsi="Consolas" w:cs="Times New Roman"/>
+          <w:color w:val="676867"/>
+          <w:kern w:val="0"/>
+          <w:sz w:val="21"/>
+          <w:szCs w:val="21"/>
+          <w:lang w:val="en-US" w:eastAsia="ja-JP"/>
+          <w14:ligatures w14:val="none"/>
+        </w:rPr>
+        <w:t>COPY</w:t>
+      </w:r>
+      <w:r>
+        <w:rPr>
+          <w:rFonts w:ascii="Consolas" w:eastAsia="Times New Roman" w:hAnsi="Consolas" w:cs="Times New Roman"/>
+          <w:color w:val="C5C8C6"/>
+          <w:kern w:val="0"/>
+          <w:sz w:val="21"/>
+          <w:szCs w:val="21"/>
+          <w:lang w:val="en-US" w:eastAsia="ja-JP"/>
+          <w14:ligatures w14:val="none"/>
+        </w:rPr>
+        <w:t xml:space="preserve"> --from=build /app/target/*.jar app.jar </w:t>
+      </w:r>
+    </w:p>
+    <w:p>
+      <w:pPr>
+        <w:shd w:val="clear" w:color="auto" w:fill="1E1E1E"/>
+        <w:spacing w:after="0" w:line="285" w:lineRule="atLeast"/>
+        <w:rPr>
+          <w:rFonts w:ascii="Consolas" w:eastAsia="Times New Roman" w:hAnsi="Consolas" w:cs="Times New Roman"/>
+          <w:color w:val="C5C8C6"/>
+          <w:kern w:val="0"/>
+          <w:sz w:val="21"/>
+          <w:szCs w:val="21"/>
+          <w:lang w:val="en-US" w:eastAsia="ja-JP"/>
+          <w14:ligatures w14:val="none"/>
+        </w:rPr>
+      </w:pPr>
+    </w:p>
+    <w:p>
+      <w:pPr>
+        <w:shd w:val="clear" w:color="auto" w:fill="1E1E1E"/>
+        <w:spacing w:after="0" w:line="285" w:lineRule="atLeast"/>
+        <w:rPr>
+          <w:rFonts w:ascii="Consolas" w:eastAsia="Times New Roman" w:hAnsi="Consolas" w:cs="Times New Roman"/>
+          <w:color w:val="C5C8C6"/>
+          <w:kern w:val="0"/>
+          <w:sz w:val="21"/>
+          <w:szCs w:val="21"/>
+          <w:lang w:val="en-US" w:eastAsia="ja-JP"/>
+          <w14:ligatures w14:val="none"/>
+        </w:rPr>
+      </w:pPr>
+      <w:r>
+        <w:rPr>
+          <w:rFonts w:ascii="Consolas" w:eastAsia="Times New Roman" w:hAnsi="Consolas" w:cs="Times New Roman"/>
+          <w:color w:val="676867"/>
+          <w:kern w:val="0"/>
+          <w:sz w:val="21"/>
+          <w:szCs w:val="21"/>
+          <w:lang w:val="en-US" w:eastAsia="ja-JP"/>
+          <w14:ligatures w14:val="none"/>
+        </w:rPr>
+        <w:t>ENTRYPOINT</w:t>
+      </w:r>
+      <w:r>
+        <w:rPr>
+          <w:rFonts w:ascii="Consolas" w:eastAsia="Times New Roman" w:hAnsi="Consolas" w:cs="Times New Roman"/>
+          <w:color w:val="C5C8C6"/>
+          <w:kern w:val="0"/>
+          <w:sz w:val="21"/>
+          <w:szCs w:val="21"/>
+          <w:lang w:val="en-US" w:eastAsia="ja-JP"/>
+          <w14:ligatures w14:val="none"/>
+        </w:rPr>
+        <w:t xml:space="preserve"> [</w:t>
+      </w:r>
+      <w:r>
+        <w:rPr>
+          <w:rFonts w:ascii="Consolas" w:eastAsia="Times New Roman" w:hAnsi="Consolas" w:cs="Times New Roman"/>
+          <w:color w:val="9AA83A"/>
+          <w:kern w:val="0"/>
+          <w:sz w:val="21"/>
+          <w:szCs w:val="21"/>
+          <w:lang w:val="en-US" w:eastAsia="ja-JP"/>
+          <w14:ligatures w14:val="none"/>
+        </w:rPr>
+        <w:t>"java"</w:t>
+      </w:r>
+      <w:r>
+        <w:rPr>
+          <w:rFonts w:ascii="Consolas" w:eastAsia="Times New Roman" w:hAnsi="Consolas" w:cs="Times New Roman"/>
+          <w:color w:val="C5C8C6"/>
+          <w:kern w:val="0"/>
+          <w:sz w:val="21"/>
+          <w:szCs w:val="21"/>
+          <w:lang w:val="en-US" w:eastAsia="ja-JP"/>
+          <w14:ligatures w14:val="none"/>
+        </w:rPr>
+        <w:t xml:space="preserve">, </w:t>
+      </w:r>
+      <w:r>
+        <w:rPr>
+          <w:rFonts w:ascii="Consolas" w:eastAsia="Times New Roman" w:hAnsi="Consolas" w:cs="Times New Roman"/>
+          <w:color w:val="9AA83A"/>
+          <w:kern w:val="0"/>
+          <w:sz w:val="21"/>
+          <w:szCs w:val="21"/>
+          <w:lang w:val="en-US" w:eastAsia="ja-JP"/>
+          <w14:ligatures w14:val="none"/>
+        </w:rPr>
+        <w:t>"-jar"</w:t>
+      </w:r>
+      <w:r>
+        <w:rPr>
+          <w:rFonts w:ascii="Consolas" w:eastAsia="Times New Roman" w:hAnsi="Consolas" w:cs="Times New Roman"/>
+          <w:color w:val="C5C8C6"/>
+          <w:kern w:val="0"/>
+          <w:sz w:val="21"/>
+          <w:szCs w:val="21"/>
+          <w:lang w:val="en-US" w:eastAsia="ja-JP"/>
+          <w14:ligatures w14:val="none"/>
+        </w:rPr>
+        <w:t xml:space="preserve">, </w:t>
+      </w:r>
+      <w:r>
+        <w:rPr>
+          <w:rFonts w:ascii="Consolas" w:eastAsia="Times New Roman" w:hAnsi="Consolas" w:cs="Times New Roman"/>
+          <w:color w:val="9AA83A"/>
+          <w:kern w:val="0"/>
+          <w:sz w:val="21"/>
+          <w:szCs w:val="21"/>
+          <w:lang w:val="en-US" w:eastAsia="ja-JP"/>
+          <w14:ligatures w14:val="none"/>
+        </w:rPr>
+        <w:t>"app.jar"</w:t>
+      </w:r>
+      <w:r>
+        <w:rPr>
+          <w:rFonts w:ascii="Consolas" w:eastAsia="Times New Roman" w:hAnsi="Consolas" w:cs="Times New Roman"/>
+          <w:color w:val="C5C8C6"/>
+          <w:kern w:val="0"/>
+          <w:sz w:val="21"/>
+          <w:szCs w:val="21"/>
+          <w:lang w:val="en-US" w:eastAsia="ja-JP"/>
+          <w14:ligatures w14:val="none"/>
+        </w:rPr>
+        <w:t xml:space="preserve">] </w:t>
+      </w:r>
+    </w:p>
+    <w:p>
+      <w:pPr>
+        <w:shd w:val="clear" w:color="auto" w:fill="1E1E1E"/>
+        <w:spacing w:after="0" w:line="285" w:lineRule="atLeast"/>
+        <w:rPr>
+          <w:rFonts w:ascii="Consolas" w:eastAsia="Times New Roman" w:hAnsi="Consolas" w:cs="Times New Roman"/>
+          <w:color w:val="C5C8C6"/>
+          <w:kern w:val="0"/>
+          <w:sz w:val="21"/>
+          <w:szCs w:val="21"/>
+          <w:lang w:val="en-US" w:eastAsia="ja-JP"/>
+          <w14:ligatures w14:val="none"/>
+        </w:rPr>
+      </w:pPr>
+    </w:p>
+    <w:p>
+      <w:pPr>
+        <w:shd w:val="clear" w:color="auto" w:fill="1E1E1E"/>
+        <w:spacing w:after="0" w:line="285" w:lineRule="atLeast"/>
+        <w:rPr>
+          <w:rFonts w:ascii="Consolas" w:eastAsia="Times New Roman" w:hAnsi="Consolas" w:cs="Times New Roman"/>
+          <w:color w:val="C5C8C6"/>
+          <w:kern w:val="0"/>
+          <w:sz w:val="21"/>
+          <w:szCs w:val="21"/>
+          <w:lang w:eastAsia="ja-JP"/>
+          <w14:ligatures w14:val="none"/>
+        </w:rPr>
+      </w:pPr>
+      <w:r>
+        <w:rPr>
+          <w:rFonts w:ascii="Consolas" w:eastAsia="Times New Roman" w:hAnsi="Consolas" w:cs="Times New Roman"/>
+          <w:color w:val="676867"/>
+          <w:kern w:val="0"/>
+          <w:sz w:val="21"/>
+          <w:szCs w:val="21"/>
+          <w:lang w:eastAsia="ja-JP"/>
+          <w14:ligatures w14:val="none"/>
+        </w:rPr>
+        <w:t>EXPOSE</w:t>
+      </w:r>
+      <w:r>
+        <w:rPr>
+          <w:rFonts w:ascii="Consolas" w:eastAsia="Times New Roman" w:hAnsi="Consolas" w:cs="Times New Roman"/>
+          <w:color w:val="C5C8C6"/>
+          <w:kern w:val="0"/>
+          <w:sz w:val="21"/>
+          <w:szCs w:val="21"/>
+          <w:lang w:eastAsia="ja-JP"/>
+          <w14:ligatures w14:val="none"/>
+        </w:rPr>
+        <w:t xml:space="preserve"> 8080</w:t>
+      </w:r>
+    </w:p>
+    <w:p>
+      <w:pPr>
+        <w:rPr>
+          <w:rFonts w:ascii="Times New Roman" w:hAnsi="Times New Roman" w:cs="Times New Roman"/>
+          <w:sz w:val="28"/>
+          <w:szCs w:val="28"/>
+          <w:lang w:val="en-US"/>
+        </w:rPr>
+      </w:pPr>
+    </w:p>
+    <w:p>
+      <w:pPr>
         <w:rPr>
           <w:rFonts w:ascii="Times New Roman" w:hAnsi="Times New Roman" w:cs="Times New Roman"/>
           <w:sz w:val="28"/>
@@ -1116,6 +3228,7 @@
           <w:rFonts w:ascii="Times New Roman" w:hAnsi="Times New Roman" w:cs="Times New Roman"/>
           <w:sz w:val="28"/>
           <w:szCs w:val="28"/>
+          <w:lang w:val="en-US"/>
         </w:rPr>
       </w:pPr>
       <w:r>
@@ -1125,31 +3238,7 @@
           <w:szCs w:val="28"/>
         </w:rPr>
         <w:tab/>
-        <w:t>В ходе данной лабораторной работы я п</w:t>
-      </w:r>
-      <w:r>
-        <w:rPr>
-          <w:rFonts w:ascii="Times New Roman" w:hAnsi="Times New Roman" w:cs="Times New Roman"/>
-          <w:sz w:val="28"/>
-          <w:szCs w:val="28"/>
-        </w:rPr>
-        <w:t>ознакоми</w:t>
-      </w:r>
-      <w:r>
-        <w:rPr>
-          <w:rFonts w:ascii="Times New Roman" w:hAnsi="Times New Roman" w:cs="Times New Roman"/>
-          <w:sz w:val="28"/>
-          <w:szCs w:val="28"/>
-        </w:rPr>
-        <w:t>л</w:t>
-      </w:r>
-      <w:r>
-        <w:rPr>
-          <w:rFonts w:ascii="Times New Roman" w:hAnsi="Times New Roman" w:cs="Times New Roman"/>
-          <w:sz w:val="28"/>
-          <w:szCs w:val="28"/>
-        </w:rPr>
-        <w:t xml:space="preserve">ся с технологией </w:t>
+        <w:t xml:space="preserve">В ходе данной лабораторной работы я познакомился с технологией </w:t>
       </w:r>
       <w:r>
         <w:rPr>
@@ -1174,23 +3263,7 @@
           <w:sz w:val="28"/>
           <w:szCs w:val="28"/>
         </w:rPr>
-        <w:t>и её концепциями, изучи</w:t>
-      </w:r>
-      <w:r>
-        <w:rPr>
-          <w:rFonts w:ascii="Times New Roman" w:hAnsi="Times New Roman" w:cs="Times New Roman"/>
-          <w:sz w:val="28"/>
-          <w:szCs w:val="28"/>
-        </w:rPr>
-        <w:t>л</w:t>
-      </w:r>
-      <w:r>
-        <w:rPr>
-          <w:rFonts w:ascii="Times New Roman" w:hAnsi="Times New Roman" w:cs="Times New Roman"/>
-          <w:sz w:val="28"/>
-          <w:szCs w:val="28"/>
-        </w:rPr>
-        <w:t xml:space="preserve"> основы команды </w:t>
+        <w:t xml:space="preserve">и её концепциями, изучил основы команды </w:t>
       </w:r>
       <w:r>
         <w:rPr>
@@ -1234,6 +3307,7 @@
         </w:rPr>
         <w:t xml:space="preserve">формат описания образов с помощью </w:t>
       </w:r>
+      <w:proofErr w:type="spellStart"/>
       <w:r>
         <w:rPr>
           <w:rFonts w:ascii="Times New Roman" w:hAnsi="Times New Roman" w:cs="Times New Roman"/>
@@ -1241,7 +3315,16 @@
           <w:szCs w:val="28"/>
           <w:lang w:val="en-US"/>
         </w:rPr>
-        <w:t>Dockerfile.</w:t>
+        <w:t>Dockerfile</w:t>
+      </w:r>
+      <w:proofErr w:type="spellEnd"/>
+      <w:r>
+        <w:rPr>
+          <w:rFonts w:ascii="Times New Roman" w:hAnsi="Times New Roman" w:cs="Times New Roman"/>
+          <w:sz w:val="28"/>
+          <w:szCs w:val="28"/>
+        </w:rPr>
+        <w:t>.</w:t>
       </w:r>
       <w:r>
         <w:rPr>
@@ -1250,6 +3333,372 @@
           <w:szCs w:val="28"/>
         </w:rPr>
         <w:t xml:space="preserve"> Выполнил самостоятельные задания на закрепление материала.</w:t>
+      </w:r>
+    </w:p>
+    <w:p>
+      <w:pPr>
+        <w:jc w:val="both"/>
+        <w:rPr>
+          <w:rFonts w:ascii="Times New Roman" w:hAnsi="Times New Roman" w:cs="Times New Roman"/>
+          <w:sz w:val="28"/>
+          <w:szCs w:val="28"/>
+          <w:lang w:val="en-US"/>
+        </w:rPr>
+      </w:pPr>
+    </w:p>
+    <w:p>
+      <w:pPr>
+        <w:jc w:val="both"/>
+        <w:rPr>
+          <w:rFonts w:ascii="Times New Roman" w:hAnsi="Times New Roman" w:cs="Times New Roman"/>
+          <w:sz w:val="28"/>
+          <w:szCs w:val="28"/>
+          <w:lang w:val="en-US"/>
+        </w:rPr>
+      </w:pPr>
+    </w:p>
+    <w:p>
+      <w:pPr>
+        <w:jc w:val="both"/>
+        <w:rPr>
+          <w:rFonts w:ascii="Times New Roman" w:hAnsi="Times New Roman" w:cs="Times New Roman"/>
+          <w:sz w:val="28"/>
+          <w:szCs w:val="28"/>
+          <w:lang w:val="en-US"/>
+        </w:rPr>
+      </w:pPr>
+    </w:p>
+    <w:p>
+      <w:pPr>
+        <w:jc w:val="both"/>
+        <w:rPr>
+          <w:rFonts w:ascii="Times New Roman" w:hAnsi="Times New Roman" w:cs="Times New Roman"/>
+          <w:sz w:val="28"/>
+          <w:szCs w:val="28"/>
+          <w:lang w:val="en-US"/>
+        </w:rPr>
+      </w:pPr>
+    </w:p>
+    <w:p>
+      <w:pPr>
+        <w:jc w:val="both"/>
+        <w:rPr>
+          <w:rFonts w:ascii="Times New Roman" w:hAnsi="Times New Roman" w:cs="Times New Roman"/>
+          <w:sz w:val="28"/>
+          <w:szCs w:val="28"/>
+          <w:lang w:val="en-US"/>
+        </w:rPr>
+      </w:pPr>
+    </w:p>
+    <w:p>
+      <w:pPr>
+        <w:jc w:val="both"/>
+        <w:rPr>
+          <w:rFonts w:ascii="Times New Roman" w:hAnsi="Times New Roman" w:cs="Times New Roman"/>
+          <w:sz w:val="28"/>
+          <w:szCs w:val="28"/>
+          <w:lang w:val="en-US"/>
+        </w:rPr>
+      </w:pPr>
+    </w:p>
+    <w:p>
+      <w:pPr>
+        <w:jc w:val="both"/>
+        <w:rPr>
+          <w:rFonts w:ascii="Times New Roman" w:hAnsi="Times New Roman" w:cs="Times New Roman"/>
+          <w:sz w:val="28"/>
+          <w:szCs w:val="28"/>
+          <w:lang w:val="en-US"/>
+        </w:rPr>
+      </w:pPr>
+    </w:p>
+    <w:p>
+      <w:pPr>
+        <w:jc w:val="center"/>
+        <w:rPr>
+          <w:rFonts w:ascii="Times New Roman" w:hAnsi="Times New Roman" w:cs="Times New Roman"/>
+          <w:b/>
+          <w:bCs/>
+          <w:sz w:val="28"/>
+          <w:szCs w:val="28"/>
+        </w:rPr>
+      </w:pPr>
+      <w:r>
+        <w:rPr>
+          <w:rFonts w:ascii="Times New Roman" w:hAnsi="Times New Roman" w:cs="Times New Roman"/>
+          <w:b/>
+          <w:bCs/>
+          <w:sz w:val="28"/>
+          <w:szCs w:val="28"/>
+        </w:rPr>
+        <w:lastRenderedPageBreak/>
+        <w:t>Контрольные вопросы</w:t>
+      </w:r>
+    </w:p>
+    <w:p>
+      <w:pPr>
+        <w:rPr>
+          <w:rFonts w:ascii="Times New Roman" w:hAnsi="Times New Roman" w:cs="Times New Roman"/>
+          <w:sz w:val="28"/>
+          <w:szCs w:val="28"/>
+        </w:rPr>
+      </w:pPr>
+      <w:r>
+        <w:rPr>
+          <w:rFonts w:ascii="Times New Roman" w:hAnsi="Times New Roman" w:cs="Times New Roman"/>
+          <w:sz w:val="28"/>
+          <w:szCs w:val="28"/>
+        </w:rPr>
+        <w:t xml:space="preserve">1. Что такое </w:t>
+      </w:r>
+      <w:proofErr w:type="spellStart"/>
+      <w:r>
+        <w:rPr>
+          <w:rFonts w:ascii="Times New Roman" w:hAnsi="Times New Roman" w:cs="Times New Roman"/>
+          <w:sz w:val="28"/>
+          <w:szCs w:val="28"/>
+        </w:rPr>
+        <w:t>Docker</w:t>
+      </w:r>
+      <w:proofErr w:type="spellEnd"/>
+      <w:r>
+        <w:rPr>
+          <w:rFonts w:ascii="Times New Roman" w:hAnsi="Times New Roman" w:cs="Times New Roman"/>
+          <w:sz w:val="28"/>
+          <w:szCs w:val="28"/>
+        </w:rPr>
+        <w:t xml:space="preserve">? Это платформа для разработки, доставки и запуска приложений в контейнерах. Она позволяет упаковывать приложения со всеми зависимостями в изолированные окружения (контейнеры), обеспечивая согласованность среды на всех этапах разработки. </w:t>
+      </w:r>
+    </w:p>
+    <w:p>
+      <w:pPr>
+        <w:rPr>
+          <w:rFonts w:ascii="Times New Roman" w:hAnsi="Times New Roman" w:cs="Times New Roman"/>
+          <w:sz w:val="28"/>
+          <w:szCs w:val="28"/>
+        </w:rPr>
+      </w:pPr>
+      <w:r>
+        <w:rPr>
+          <w:rFonts w:ascii="Times New Roman" w:hAnsi="Times New Roman" w:cs="Times New Roman"/>
+          <w:sz w:val="28"/>
+          <w:szCs w:val="28"/>
+        </w:rPr>
+        <w:t xml:space="preserve">2. Что такое образ? Это неизменяемый шаблон, содержащий файловую систему, зависимости, настройки и код приложения, необходимые для запуска контейнера. Образ состоит из слоев и используется как основа для создания контейнеров. </w:t>
+      </w:r>
+    </w:p>
+    <w:p>
+      <w:pPr>
+        <w:rPr>
+          <w:rFonts w:ascii="Times New Roman" w:hAnsi="Times New Roman" w:cs="Times New Roman"/>
+          <w:sz w:val="28"/>
+          <w:szCs w:val="28"/>
+        </w:rPr>
+      </w:pPr>
+      <w:r>
+        <w:rPr>
+          <w:rFonts w:ascii="Times New Roman" w:hAnsi="Times New Roman" w:cs="Times New Roman"/>
+          <w:sz w:val="28"/>
+          <w:szCs w:val="28"/>
+        </w:rPr>
+        <w:t xml:space="preserve">3. Что такое контейнер? Это запущенный экземпляр образа, некое изолированное окружение с собственными процессами, файловой системой и сетевыми ресурсами. Контейнеры легковесны, так как используют ядро хост-ОС и не требуют полной виртуализации аппаратного обеспечения. </w:t>
+      </w:r>
+    </w:p>
+    <w:p>
+      <w:pPr>
+        <w:rPr>
+          <w:rFonts w:ascii="Times New Roman" w:hAnsi="Times New Roman" w:cs="Times New Roman"/>
+          <w:sz w:val="28"/>
+          <w:szCs w:val="28"/>
+        </w:rPr>
+      </w:pPr>
+      <w:r>
+        <w:rPr>
+          <w:rFonts w:ascii="Times New Roman" w:hAnsi="Times New Roman" w:cs="Times New Roman"/>
+          <w:sz w:val="28"/>
+          <w:szCs w:val="28"/>
+        </w:rPr>
+        <w:t xml:space="preserve">4. Анализ ошибки в терминале. Причина ошибки в том, что в используемом </w:t>
+      </w:r>
+      <w:proofErr w:type="spellStart"/>
+      <w:r>
+        <w:rPr>
+          <w:rFonts w:ascii="Times New Roman" w:hAnsi="Times New Roman" w:cs="Times New Roman"/>
+          <w:sz w:val="28"/>
+          <w:szCs w:val="28"/>
+        </w:rPr>
+        <w:t>Dockerfile</w:t>
+      </w:r>
+      <w:proofErr w:type="spellEnd"/>
+      <w:r>
+        <w:rPr>
+          <w:rFonts w:ascii="Times New Roman" w:hAnsi="Times New Roman" w:cs="Times New Roman"/>
+          <w:sz w:val="28"/>
+          <w:szCs w:val="28"/>
+        </w:rPr>
+        <w:t xml:space="preserve"> используется только инструкция CMD ["</w:t>
+      </w:r>
+      <w:proofErr w:type="spellStart"/>
+      <w:r>
+        <w:rPr>
+          <w:rFonts w:ascii="Times New Roman" w:hAnsi="Times New Roman" w:cs="Times New Roman"/>
+          <w:sz w:val="28"/>
+          <w:szCs w:val="28"/>
+        </w:rPr>
+        <w:t>python</w:t>
+      </w:r>
+      <w:proofErr w:type="spellEnd"/>
+      <w:r>
+        <w:rPr>
+          <w:rFonts w:ascii="Times New Roman" w:hAnsi="Times New Roman" w:cs="Times New Roman"/>
+          <w:sz w:val="28"/>
+          <w:szCs w:val="28"/>
+        </w:rPr>
+        <w:t xml:space="preserve">", "main.py"]. Тогда при запуске </w:t>
+      </w:r>
+      <w:proofErr w:type="spellStart"/>
+      <w:r>
+        <w:rPr>
+          <w:rFonts w:ascii="Times New Roman" w:hAnsi="Times New Roman" w:cs="Times New Roman"/>
+          <w:sz w:val="28"/>
+          <w:szCs w:val="28"/>
+        </w:rPr>
+        <w:t>docker</w:t>
+      </w:r>
+      <w:proofErr w:type="spellEnd"/>
+      <w:r>
+        <w:rPr>
+          <w:rFonts w:ascii="Times New Roman" w:hAnsi="Times New Roman" w:cs="Times New Roman"/>
+          <w:sz w:val="28"/>
+          <w:szCs w:val="28"/>
+        </w:rPr>
+        <w:t xml:space="preserve"> </w:t>
+      </w:r>
+      <w:proofErr w:type="spellStart"/>
+      <w:r>
+        <w:rPr>
+          <w:rFonts w:ascii="Times New Roman" w:hAnsi="Times New Roman" w:cs="Times New Roman"/>
+          <w:sz w:val="28"/>
+          <w:szCs w:val="28"/>
+        </w:rPr>
+        <w:t>run</w:t>
+      </w:r>
+      <w:proofErr w:type="spellEnd"/>
+      <w:r>
+        <w:rPr>
+          <w:rFonts w:ascii="Times New Roman" w:hAnsi="Times New Roman" w:cs="Times New Roman"/>
+          <w:sz w:val="28"/>
+          <w:szCs w:val="28"/>
+        </w:rPr>
+        <w:t xml:space="preserve"> ... </w:t>
+      </w:r>
+      <w:proofErr w:type="spellStart"/>
+      <w:r>
+        <w:rPr>
+          <w:rFonts w:ascii="Times New Roman" w:hAnsi="Times New Roman" w:cs="Times New Roman"/>
+          <w:sz w:val="28"/>
+          <w:szCs w:val="28"/>
+        </w:rPr>
+        <w:t>Andrey</w:t>
+      </w:r>
+      <w:proofErr w:type="spellEnd"/>
+      <w:r>
+        <w:rPr>
+          <w:rFonts w:ascii="Times New Roman" w:hAnsi="Times New Roman" w:cs="Times New Roman"/>
+          <w:sz w:val="28"/>
+          <w:szCs w:val="28"/>
+        </w:rPr>
+        <w:t xml:space="preserve"> аргумент "</w:t>
+      </w:r>
+      <w:proofErr w:type="spellStart"/>
+      <w:r>
+        <w:rPr>
+          <w:rFonts w:ascii="Times New Roman" w:hAnsi="Times New Roman" w:cs="Times New Roman"/>
+          <w:sz w:val="28"/>
+          <w:szCs w:val="28"/>
+        </w:rPr>
+        <w:t>Andrey</w:t>
+      </w:r>
+      <w:proofErr w:type="spellEnd"/>
+      <w:r>
+        <w:rPr>
+          <w:rFonts w:ascii="Times New Roman" w:hAnsi="Times New Roman" w:cs="Times New Roman"/>
+          <w:sz w:val="28"/>
+          <w:szCs w:val="28"/>
+        </w:rPr>
+        <w:t>" полностью заменяет CMD, и контейнер пытается выполнить "</w:t>
+      </w:r>
+      <w:proofErr w:type="spellStart"/>
+      <w:r>
+        <w:rPr>
+          <w:rFonts w:ascii="Times New Roman" w:hAnsi="Times New Roman" w:cs="Times New Roman"/>
+          <w:sz w:val="28"/>
+          <w:szCs w:val="28"/>
+        </w:rPr>
+        <w:t>Andrey</w:t>
+      </w:r>
+      <w:proofErr w:type="spellEnd"/>
+      <w:r>
+        <w:rPr>
+          <w:rFonts w:ascii="Times New Roman" w:hAnsi="Times New Roman" w:cs="Times New Roman"/>
+          <w:sz w:val="28"/>
+          <w:szCs w:val="28"/>
+        </w:rPr>
+        <w:t>" как команду, которой нет в системе. Устранить ошибку можно, использовав ENTRYPOINT для фиксации исполняемого файла (ENTRYPOINT ["</w:t>
+      </w:r>
+      <w:proofErr w:type="spellStart"/>
+      <w:r>
+        <w:rPr>
+          <w:rFonts w:ascii="Times New Roman" w:hAnsi="Times New Roman" w:cs="Times New Roman"/>
+          <w:sz w:val="28"/>
+          <w:szCs w:val="28"/>
+        </w:rPr>
+        <w:t>python</w:t>
+      </w:r>
+      <w:proofErr w:type="spellEnd"/>
+      <w:r>
+        <w:rPr>
+          <w:rFonts w:ascii="Times New Roman" w:hAnsi="Times New Roman" w:cs="Times New Roman"/>
+          <w:sz w:val="28"/>
+          <w:szCs w:val="28"/>
+        </w:rPr>
+        <w:t>"]) и CMD для передачи аргументов по умолчанию (CMD ["main.py"]). В этом случае "</w:t>
+      </w:r>
+      <w:proofErr w:type="spellStart"/>
+      <w:r>
+        <w:rPr>
+          <w:rFonts w:ascii="Times New Roman" w:hAnsi="Times New Roman" w:cs="Times New Roman"/>
+          <w:sz w:val="28"/>
+          <w:szCs w:val="28"/>
+        </w:rPr>
+        <w:t>Andrey</w:t>
+      </w:r>
+      <w:proofErr w:type="spellEnd"/>
+      <w:r>
+        <w:rPr>
+          <w:rFonts w:ascii="Times New Roman" w:hAnsi="Times New Roman" w:cs="Times New Roman"/>
+          <w:sz w:val="28"/>
+          <w:szCs w:val="28"/>
+        </w:rPr>
+        <w:t xml:space="preserve">" будет передаваться как аргумент к </w:t>
+      </w:r>
+      <w:proofErr w:type="spellStart"/>
+      <w:r>
+        <w:rPr>
+          <w:rFonts w:ascii="Times New Roman" w:hAnsi="Times New Roman" w:cs="Times New Roman"/>
+          <w:sz w:val="28"/>
+          <w:szCs w:val="28"/>
+        </w:rPr>
+        <w:t>python</w:t>
+      </w:r>
+      <w:proofErr w:type="spellEnd"/>
+      <w:r>
+        <w:rPr>
+          <w:rFonts w:ascii="Times New Roman" w:hAnsi="Times New Roman" w:cs="Times New Roman"/>
+          <w:sz w:val="28"/>
+          <w:szCs w:val="28"/>
+        </w:rPr>
+        <w:t>, а не заменять ее.</w:t>
       </w:r>
     </w:p>
     <w:p>

</xml_diff>